<commit_message>
docs: documentation technique v1.1 (remarques du 22/09)
- API.md : 64 endpoints (messages de l'editeur, versions revisees),
  nouveau parcours des statuts, vue restreinte de l'auteur sur les
  evaluations, proxy PDF Cloudinary, 19 modeles d'emails
- ARCHITECTURE.md : table editor_messages, colonnes de revision,
  etapes auteur (statusGroups), regles de publication (APC + PDF),
  confidentialite de l'evaluation cote serveur, points d'attention
  (PDF Cloudinary, editor_id sans ON DELETE, statusGroups)
- EXPLOITATION.md : incidents "Upstream error" et publication 409
- Documentation Technique JAEI.docx regeneree (v1.1)

Co-Authored-By: Claude Opus 5 <noreply@anthropic.com>
</commit_message>
<xml_diff>
--- a/Documentation Technique JAEI.docx
+++ b/Documentation Technique JAEI.docx
@@ -328,7 +328,7 @@
                 <w:sz w:val="19"/>
                 <w:szCs w:val="19"/>
               </w:rPr>
-              <w:t xml:space="preserve">1.0</w:t>
+              <w:t xml:space="preserve">1.1</w:t>
             </w:r>
           </w:p>
         </w:tc>
@@ -400,7 +400,7 @@
                 <w:sz w:val="19"/>
                 <w:szCs w:val="19"/>
               </w:rPr>
-              <w:t xml:space="preserve">main — a36ecb9</w:t>
+              <w:t xml:space="preserve">main — 1599152</w:t>
             </w:r>
           </w:p>
         </w:tc>
@@ -472,7 +472,7 @@
                 <w:sz w:val="19"/>
                 <w:szCs w:val="19"/>
               </w:rPr>
-              <w:t xml:space="preserve">17 septembre 2026</w:t>
+              <w:t xml:space="preserve">22 septembre 2026</w:t>
             </w:r>
           </w:p>
         </w:tc>
@@ -4225,7 +4225,7 @@
           <w:sz w:val="21"/>
           <w:szCs w:val="21"/>
         </w:rPr>
-        <w:t xml:space="preserve">Quatre services transverses complètent ces modules : l'envoi des emails (seize modèles), l'assistance par intelligence artificielle, le stockage des fichiers et la génération des notifications.</w:t>
+        <w:t xml:space="preserve">Quatre services transverses complètent ces modules : l'envoi des emails (dix-neuf modèles), l'assistance par intelligence artificielle, le stockage des fichiers et la génération des notifications.</w:t>
       </w:r>
     </w:p>
     <w:p>
@@ -5542,7 +5542,7 @@
           <w:sz w:val="21"/>
           <w:szCs w:val="21"/>
         </w:rPr>
-        <w:t xml:space="preserve">La base compte neuf tables. Toutes les clés étrangères portent une règle de suppression explicite, afin qu'aucune donnée orpheline ne subsiste.</w:t>
+        <w:t xml:space="preserve">La base compte dix tables. Les clés étrangères portent une règle de suppression explicite, afin qu'aucune donnée orpheline ne subsiste — une exception est signalée au chapitre 10.</w:t>
       </w:r>
     </w:p>
     <w:p>
@@ -5855,7 +5855,7 @@
                 <w:sz w:val="18"/>
                 <w:szCs w:val="18"/>
               </w:rPr>
-              <w:t xml:space="preserve">Fichiers rattachés à une soumission : manuscrit, lettre d'accompagnement, figures, tableaux, avec libellé, description et ordre d'affichage</w:t>
+              <w:t xml:space="preserve">Fichiers rattachés à une soumission : manuscrit, lettre d'accompagnement, figures, tableaux, avec libellé, description, ordre d'affichage et numéro de version (0 = soumission initiale, 1, 2… = versions révisées)</w:t>
             </w:r>
           </w:p>
         </w:tc>
@@ -5892,7 +5892,7 @@
                 <w:sz w:val="18"/>
                 <w:szCs w:val="18"/>
               </w:rPr>
-              <w:t xml:space="preserve">reviews</w:t>
+              <w:t xml:space="preserve">editor_messages</w:t>
             </w:r>
           </w:p>
         </w:tc>
@@ -5927,7 +5927,7 @@
                 <w:sz w:val="18"/>
                 <w:szCs w:val="18"/>
               </w:rPr>
-              <w:t xml:space="preserve">Une ligne par couple soumission / reviewer : commentaires destinés à l'auteur, commentaires confidentiels réservés à l'éditeur, recommandation, fichier annoté, jeton d'invitation, dates d'acceptation ou de refus</w:t>
+              <w:t xml:space="preserve">Messages de l'éditeur à l'auteur : seul contenu éditorial visible par l'auteur, sur sa plateforme comme dans ses emails. Chaque message peut accompagner une décision</w:t>
             </w:r>
           </w:p>
         </w:tc>
@@ -5964,7 +5964,7 @@
                 <w:sz w:val="18"/>
                 <w:szCs w:val="18"/>
               </w:rPr>
-              <w:t xml:space="preserve">payments</w:t>
+              <w:t xml:space="preserve">reviews</w:t>
             </w:r>
           </w:p>
         </w:tc>
@@ -5999,7 +5999,7 @@
                 <w:sz w:val="18"/>
                 <w:szCs w:val="18"/>
               </w:rPr>
-              <w:t xml:space="preserve">Transactions : montant, devise, moyen de paiement, identifiant de transaction unique, statut et date de règlement</w:t>
+              <w:t xml:space="preserve">Une ligne par couple soumission / reviewer : commentaires destinés à l'auteur, commentaires confidentiels réservés à l'éditeur, recommandation, fichier annoté, jeton d'invitation, dates d'acceptation ou de refus</w:t>
             </w:r>
           </w:p>
         </w:tc>
@@ -6036,7 +6036,7 @@
                 <w:sz w:val="18"/>
                 <w:szCs w:val="18"/>
               </w:rPr>
-              <w:t xml:space="preserve">research_areas</w:t>
+              <w:t xml:space="preserve">payments</w:t>
             </w:r>
           </w:p>
         </w:tc>
@@ -6071,7 +6071,7 @@
                 <w:sz w:val="18"/>
                 <w:szCs w:val="18"/>
               </w:rPr>
-              <w:t xml:space="preserve">Les huit domaines scientifiques officiels du journal</w:t>
+              <w:t xml:space="preserve">Transactions : montant, devise, moyen de paiement, identifiant de transaction unique, statut et date de règlement</w:t>
             </w:r>
           </w:p>
         </w:tc>
@@ -6108,7 +6108,7 @@
                 <w:sz w:val="18"/>
                 <w:szCs w:val="18"/>
               </w:rPr>
-              <w:t xml:space="preserve">published_articles</w:t>
+              <w:t xml:space="preserve">research_areas</w:t>
             </w:r>
           </w:p>
         </w:tc>
@@ -6143,7 +6143,7 @@
                 <w:sz w:val="18"/>
                 <w:szCs w:val="18"/>
               </w:rPr>
-              <w:t xml:space="preserve">Identifiant DOI et compteur de consultations des articles publiés</w:t>
+              <w:t xml:space="preserve">Les huit domaines scientifiques officiels du journal</w:t>
             </w:r>
           </w:p>
         </w:tc>
@@ -6180,7 +6180,7 @@
                 <w:sz w:val="18"/>
                 <w:szCs w:val="18"/>
               </w:rPr>
-              <w:t xml:space="preserve">editorial_members</w:t>
+              <w:t xml:space="preserve">published_articles</w:t>
             </w:r>
           </w:p>
         </w:tc>
@@ -6215,7 +6215,7 @@
                 <w:sz w:val="18"/>
                 <w:szCs w:val="18"/>
               </w:rPr>
-              <w:t xml:space="preserve">Comité éditorial : fonction, nom, affiliation, ordre d'affichage. Alimente la page « About » du site</w:t>
+              <w:t xml:space="preserve">Identifiant DOI et compteur de consultations des articles publiés</w:t>
             </w:r>
           </w:p>
         </w:tc>
@@ -6252,6 +6252,78 @@
                 <w:sz w:val="18"/>
                 <w:szCs w:val="18"/>
               </w:rPr>
+              <w:t xml:space="preserve">editorial_members</w:t>
+            </w:r>
+          </w:p>
+        </w:tc>
+        <w:tc>
+          <w:tcPr>
+            <w:tcW w:type="dxa" w:w="6926"/>
+            <w:tcBorders>
+              <w:top w:val="single" w:color="D8DEDA" w:sz="2"/>
+              <w:left w:val="single" w:color="D8DEDA" w:sz="2"/>
+              <w:bottom w:val="single" w:color="D8DEDA" w:sz="2"/>
+              <w:right w:val="single" w:color="D8DEDA" w:sz="2"/>
+            </w:tcBorders>
+            <w:shd w:fill="FFFFFF" w:val="clear"/>
+            <w:tcMar>
+              <w:top w:type="dxa" w:w="70"/>
+              <w:left w:type="dxa" w:w="110"/>
+              <w:bottom w:type="dxa" w:w="70"/>
+              <w:right w:type="dxa" w:w="110"/>
+            </w:tcMar>
+            <w:vAlign w:val="center"/>
+          </w:tcPr>
+          <w:p>
+            <w:pPr>
+              <w:spacing w:after="0"/>
+            </w:pPr>
+            <w:r>
+              <w:rPr>
+                <w:rFonts w:ascii="Arial" w:cs="Arial" w:eastAsia="Arial" w:hAnsi="Arial"/>
+                <w:b w:val="false"/>
+                <w:bCs w:val="false"/>
+                <w:color w:val="1F2937"/>
+                <w:sz w:val="18"/>
+                <w:szCs w:val="18"/>
+              </w:rPr>
+              <w:t xml:space="preserve">Comité éditorial : fonction, nom, affiliation, ordre d'affichage. Alimente la page « About » du site</w:t>
+            </w:r>
+          </w:p>
+        </w:tc>
+      </w:tr>
+      <w:tr>
+        <w:tc>
+          <w:tcPr>
+            <w:tcW w:type="dxa" w:w="2100"/>
+            <w:tcBorders>
+              <w:top w:val="single" w:color="D8DEDA" w:sz="2"/>
+              <w:left w:val="single" w:color="D8DEDA" w:sz="2"/>
+              <w:bottom w:val="single" w:color="D8DEDA" w:sz="2"/>
+              <w:right w:val="single" w:color="D8DEDA" w:sz="2"/>
+            </w:tcBorders>
+            <w:shd w:fill="F3F6F4" w:val="clear"/>
+            <w:tcMar>
+              <w:top w:type="dxa" w:w="70"/>
+              <w:left w:type="dxa" w:w="110"/>
+              <w:bottom w:type="dxa" w:w="70"/>
+              <w:right w:type="dxa" w:w="110"/>
+            </w:tcMar>
+            <w:vAlign w:val="center"/>
+          </w:tcPr>
+          <w:p>
+            <w:pPr>
+              <w:spacing w:after="0"/>
+            </w:pPr>
+            <w:r>
+              <w:rPr>
+                <w:rFonts w:ascii="Arial" w:cs="Arial" w:eastAsia="Arial" w:hAnsi="Arial"/>
+                <w:b w:val="false"/>
+                <w:bCs w:val="false"/>
+                <w:color w:val="1F2937"/>
+                <w:sz w:val="18"/>
+                <w:szCs w:val="18"/>
+              </w:rPr>
               <w:t xml:space="preserve">notifications</w:t>
             </w:r>
           </w:p>
@@ -6265,7 +6337,7 @@
               <w:bottom w:val="single" w:color="D8DEDA" w:sz="2"/>
               <w:right w:val="single" w:color="D8DEDA" w:sz="2"/>
             </w:tcBorders>
-            <w:shd w:fill="FFFFFF" w:val="clear"/>
+            <w:shd w:fill="F3F6F4" w:val="clear"/>
             <w:tcMar>
               <w:top w:type="dxa" w:w="70"/>
               <w:left w:type="dxa" w:w="110"/>
@@ -6569,6 +6641,795 @@
     </w:p>
     <w:p>
       <w:pPr>
+        <w:spacing w:after="130"/>
+        <w:jc w:val="both"/>
+      </w:pPr>
+      <w:r>
+        <w:rPr>
+          <w:rFonts w:ascii="Arial" w:cs="Arial" w:eastAsia="Arial" w:hAnsi="Arial"/>
+          <w:sz w:val="21"/>
+          <w:szCs w:val="21"/>
+        </w:rPr>
+        <w:t xml:space="preserve">L'espace de l'auteur présente six étapes, conformément à la définition retenue par le comité éditorial. Chaque étape regroupe un ou plusieurs statuts techniques.</w:t>
+      </w:r>
+    </w:p>
+    <w:tbl>
+      <w:tblPr>
+        <w:tblW w:type="dxa" w:w="9026"/>
+        <w:tblBorders>
+          <w:top w:val="single" w:color="auto" w:sz="4"/>
+          <w:left w:val="single" w:color="auto" w:sz="4"/>
+          <w:bottom w:val="single" w:color="auto" w:sz="4"/>
+          <w:right w:val="single" w:color="auto" w:sz="4"/>
+          <w:insideH w:val="single" w:color="auto" w:sz="4"/>
+          <w:insideV w:val="single" w:color="auto" w:sz="4"/>
+        </w:tblBorders>
+      </w:tblPr>
+      <w:tblGrid>
+        <w:gridCol w:w="1900"/>
+        <w:gridCol w:w="3900"/>
+        <w:gridCol w:w="3226"/>
+      </w:tblGrid>
+      <w:tr>
+        <w:trPr>
+          <w:tblHeader/>
+        </w:trPr>
+        <w:tc>
+          <w:tcPr>
+            <w:tcW w:type="dxa" w:w="1900"/>
+            <w:tcBorders>
+              <w:top w:val="single" w:color="D8DEDA" w:sz="2"/>
+              <w:left w:val="single" w:color="D8DEDA" w:sz="2"/>
+              <w:bottom w:val="single" w:color="D8DEDA" w:sz="2"/>
+              <w:right w:val="single" w:color="D8DEDA" w:sz="2"/>
+            </w:tcBorders>
+            <w:shd w:fill="1B4427" w:val="clear"/>
+            <w:tcMar>
+              <w:top w:type="dxa" w:w="70"/>
+              <w:left w:type="dxa" w:w="110"/>
+              <w:bottom w:type="dxa" w:w="70"/>
+              <w:right w:type="dxa" w:w="110"/>
+            </w:tcMar>
+            <w:vAlign w:val="center"/>
+          </w:tcPr>
+          <w:p>
+            <w:pPr>
+              <w:spacing w:after="0"/>
+            </w:pPr>
+            <w:r>
+              <w:rPr>
+                <w:rFonts w:ascii="Arial" w:cs="Arial" w:eastAsia="Arial" w:hAnsi="Arial"/>
+                <w:b/>
+                <w:bCs/>
+                <w:color w:val="FFFFFF"/>
+                <w:sz w:val="18"/>
+                <w:szCs w:val="18"/>
+              </w:rPr>
+              <w:t xml:space="preserve">Étape (onglet auteur)</w:t>
+            </w:r>
+          </w:p>
+        </w:tc>
+        <w:tc>
+          <w:tcPr>
+            <w:tcW w:type="dxa" w:w="3900"/>
+            <w:tcBorders>
+              <w:top w:val="single" w:color="D8DEDA" w:sz="2"/>
+              <w:left w:val="single" w:color="D8DEDA" w:sz="2"/>
+              <w:bottom w:val="single" w:color="D8DEDA" w:sz="2"/>
+              <w:right w:val="single" w:color="D8DEDA" w:sz="2"/>
+            </w:tcBorders>
+            <w:shd w:fill="1B4427" w:val="clear"/>
+            <w:tcMar>
+              <w:top w:type="dxa" w:w="70"/>
+              <w:left w:type="dxa" w:w="110"/>
+              <w:bottom w:type="dxa" w:w="70"/>
+              <w:right w:type="dxa" w:w="110"/>
+            </w:tcMar>
+            <w:vAlign w:val="center"/>
+          </w:tcPr>
+          <w:p>
+            <w:pPr>
+              <w:spacing w:after="0"/>
+            </w:pPr>
+            <w:r>
+              <w:rPr>
+                <w:rFonts w:ascii="Arial" w:cs="Arial" w:eastAsia="Arial" w:hAnsi="Arial"/>
+                <w:b/>
+                <w:bCs/>
+                <w:color w:val="FFFFFF"/>
+                <w:sz w:val="18"/>
+                <w:szCs w:val="18"/>
+              </w:rPr>
+              <w:t xml:space="preserve">Déclencheur</w:t>
+            </w:r>
+          </w:p>
+        </w:tc>
+        <w:tc>
+          <w:tcPr>
+            <w:tcW w:type="dxa" w:w="3226"/>
+            <w:tcBorders>
+              <w:top w:val="single" w:color="D8DEDA" w:sz="2"/>
+              <w:left w:val="single" w:color="D8DEDA" w:sz="2"/>
+              <w:bottom w:val="single" w:color="D8DEDA" w:sz="2"/>
+              <w:right w:val="single" w:color="D8DEDA" w:sz="2"/>
+            </w:tcBorders>
+            <w:shd w:fill="1B4427" w:val="clear"/>
+            <w:tcMar>
+              <w:top w:type="dxa" w:w="70"/>
+              <w:left w:type="dxa" w:w="110"/>
+              <w:bottom w:type="dxa" w:w="70"/>
+              <w:right w:type="dxa" w:w="110"/>
+            </w:tcMar>
+            <w:vAlign w:val="center"/>
+          </w:tcPr>
+          <w:p>
+            <w:pPr>
+              <w:spacing w:after="0"/>
+            </w:pPr>
+            <w:r>
+              <w:rPr>
+                <w:rFonts w:ascii="Arial" w:cs="Arial" w:eastAsia="Arial" w:hAnsi="Arial"/>
+                <w:b/>
+                <w:bCs/>
+                <w:color w:val="FFFFFF"/>
+                <w:sz w:val="18"/>
+                <w:szCs w:val="18"/>
+              </w:rPr>
+              <w:t xml:space="preserve">Statuts techniques</w:t>
+            </w:r>
+          </w:p>
+        </w:tc>
+      </w:tr>
+      <w:tr>
+        <w:tc>
+          <w:tcPr>
+            <w:tcW w:type="dxa" w:w="1900"/>
+            <w:tcBorders>
+              <w:top w:val="single" w:color="D8DEDA" w:sz="2"/>
+              <w:left w:val="single" w:color="D8DEDA" w:sz="2"/>
+              <w:bottom w:val="single" w:color="D8DEDA" w:sz="2"/>
+              <w:right w:val="single" w:color="D8DEDA" w:sz="2"/>
+            </w:tcBorders>
+            <w:shd w:fill="FFFFFF" w:val="clear"/>
+            <w:tcMar>
+              <w:top w:type="dxa" w:w="70"/>
+              <w:left w:type="dxa" w:w="110"/>
+              <w:bottom w:type="dxa" w:w="70"/>
+              <w:right w:type="dxa" w:w="110"/>
+            </w:tcMar>
+            <w:vAlign w:val="center"/>
+          </w:tcPr>
+          <w:p>
+            <w:pPr>
+              <w:spacing w:after="0"/>
+            </w:pPr>
+            <w:r>
+              <w:rPr>
+                <w:rFonts w:ascii="Arial" w:cs="Arial" w:eastAsia="Arial" w:hAnsi="Arial"/>
+                <w:b w:val="false"/>
+                <w:bCs w:val="false"/>
+                <w:color w:val="1F2937"/>
+                <w:sz w:val="18"/>
+                <w:szCs w:val="18"/>
+              </w:rPr>
+              <w:t xml:space="preserve">Submitted</w:t>
+            </w:r>
+          </w:p>
+        </w:tc>
+        <w:tc>
+          <w:tcPr>
+            <w:tcW w:type="dxa" w:w="3900"/>
+            <w:tcBorders>
+              <w:top w:val="single" w:color="D8DEDA" w:sz="2"/>
+              <w:left w:val="single" w:color="D8DEDA" w:sz="2"/>
+              <w:bottom w:val="single" w:color="D8DEDA" w:sz="2"/>
+              <w:right w:val="single" w:color="D8DEDA" w:sz="2"/>
+            </w:tcBorders>
+            <w:shd w:fill="FFFFFF" w:val="clear"/>
+            <w:tcMar>
+              <w:top w:type="dxa" w:w="70"/>
+              <w:left w:type="dxa" w:w="110"/>
+              <w:bottom w:type="dxa" w:w="70"/>
+              <w:right w:type="dxa" w:w="110"/>
+            </w:tcMar>
+            <w:vAlign w:val="center"/>
+          </w:tcPr>
+          <w:p>
+            <w:pPr>
+              <w:spacing w:after="0"/>
+            </w:pPr>
+            <w:r>
+              <w:rPr>
+                <w:rFonts w:ascii="Arial" w:cs="Arial" w:eastAsia="Arial" w:hAnsi="Arial"/>
+                <w:b w:val="false"/>
+                <w:bCs w:val="false"/>
+                <w:color w:val="1F2937"/>
+                <w:sz w:val="18"/>
+                <w:szCs w:val="18"/>
+              </w:rPr>
+              <w:t xml:space="preserve">L'auteur soumet son manuscrit</w:t>
+            </w:r>
+          </w:p>
+        </w:tc>
+        <w:tc>
+          <w:tcPr>
+            <w:tcW w:type="dxa" w:w="3226"/>
+            <w:tcBorders>
+              <w:top w:val="single" w:color="D8DEDA" w:sz="2"/>
+              <w:left w:val="single" w:color="D8DEDA" w:sz="2"/>
+              <w:bottom w:val="single" w:color="D8DEDA" w:sz="2"/>
+              <w:right w:val="single" w:color="D8DEDA" w:sz="2"/>
+            </w:tcBorders>
+            <w:shd w:fill="FFFFFF" w:val="clear"/>
+            <w:tcMar>
+              <w:top w:type="dxa" w:w="70"/>
+              <w:left w:type="dxa" w:w="110"/>
+              <w:bottom w:type="dxa" w:w="70"/>
+              <w:right w:type="dxa" w:w="110"/>
+            </w:tcMar>
+            <w:vAlign w:val="center"/>
+          </w:tcPr>
+          <w:p>
+            <w:pPr>
+              <w:spacing w:after="0"/>
+            </w:pPr>
+            <w:r>
+              <w:rPr>
+                <w:rFonts w:ascii="Arial" w:cs="Arial" w:eastAsia="Arial" w:hAnsi="Arial"/>
+                <w:b w:val="false"/>
+                <w:bCs w:val="false"/>
+                <w:color w:val="1F2937"/>
+                <w:sz w:val="18"/>
+                <w:szCs w:val="18"/>
+              </w:rPr>
+              <w:t xml:space="preserve">pending, submitted</w:t>
+            </w:r>
+          </w:p>
+        </w:tc>
+      </w:tr>
+      <w:tr>
+        <w:tc>
+          <w:tcPr>
+            <w:tcW w:type="dxa" w:w="1900"/>
+            <w:tcBorders>
+              <w:top w:val="single" w:color="D8DEDA" w:sz="2"/>
+              <w:left w:val="single" w:color="D8DEDA" w:sz="2"/>
+              <w:bottom w:val="single" w:color="D8DEDA" w:sz="2"/>
+              <w:right w:val="single" w:color="D8DEDA" w:sz="2"/>
+            </w:tcBorders>
+            <w:shd w:fill="F3F6F4" w:val="clear"/>
+            <w:tcMar>
+              <w:top w:type="dxa" w:w="70"/>
+              <w:left w:type="dxa" w:w="110"/>
+              <w:bottom w:type="dxa" w:w="70"/>
+              <w:right w:type="dxa" w:w="110"/>
+            </w:tcMar>
+            <w:vAlign w:val="center"/>
+          </w:tcPr>
+          <w:p>
+            <w:pPr>
+              <w:spacing w:after="0"/>
+            </w:pPr>
+            <w:r>
+              <w:rPr>
+                <w:rFonts w:ascii="Arial" w:cs="Arial" w:eastAsia="Arial" w:hAnsi="Arial"/>
+                <w:b w:val="false"/>
+                <w:bCs w:val="false"/>
+                <w:color w:val="1F2937"/>
+                <w:sz w:val="18"/>
+                <w:szCs w:val="18"/>
+              </w:rPr>
+              <w:t xml:space="preserve">Under review</w:t>
+            </w:r>
+          </w:p>
+        </w:tc>
+        <w:tc>
+          <w:tcPr>
+            <w:tcW w:type="dxa" w:w="3900"/>
+            <w:tcBorders>
+              <w:top w:val="single" w:color="D8DEDA" w:sz="2"/>
+              <w:left w:val="single" w:color="D8DEDA" w:sz="2"/>
+              <w:bottom w:val="single" w:color="D8DEDA" w:sz="2"/>
+              <w:right w:val="single" w:color="D8DEDA" w:sz="2"/>
+            </w:tcBorders>
+            <w:shd w:fill="F3F6F4" w:val="clear"/>
+            <w:tcMar>
+              <w:top w:type="dxa" w:w="70"/>
+              <w:left w:type="dxa" w:w="110"/>
+              <w:bottom w:type="dxa" w:w="70"/>
+              <w:right w:type="dxa" w:w="110"/>
+            </w:tcMar>
+            <w:vAlign w:val="center"/>
+          </w:tcPr>
+          <w:p>
+            <w:pPr>
+              <w:spacing w:after="0"/>
+            </w:pPr>
+            <w:r>
+              <w:rPr>
+                <w:rFonts w:ascii="Arial" w:cs="Arial" w:eastAsia="Arial" w:hAnsi="Arial"/>
+                <w:b w:val="false"/>
+                <w:bCs w:val="false"/>
+                <w:color w:val="1F2937"/>
+                <w:sz w:val="18"/>
+                <w:szCs w:val="18"/>
+              </w:rPr>
+              <w:t xml:space="preserve">Un reviewer accepte l'invitation</w:t>
+            </w:r>
+          </w:p>
+        </w:tc>
+        <w:tc>
+          <w:tcPr>
+            <w:tcW w:type="dxa" w:w="3226"/>
+            <w:tcBorders>
+              <w:top w:val="single" w:color="D8DEDA" w:sz="2"/>
+              <w:left w:val="single" w:color="D8DEDA" w:sz="2"/>
+              <w:bottom w:val="single" w:color="D8DEDA" w:sz="2"/>
+              <w:right w:val="single" w:color="D8DEDA" w:sz="2"/>
+            </w:tcBorders>
+            <w:shd w:fill="F3F6F4" w:val="clear"/>
+            <w:tcMar>
+              <w:top w:type="dxa" w:w="70"/>
+              <w:left w:type="dxa" w:w="110"/>
+              <w:bottom w:type="dxa" w:w="70"/>
+              <w:right w:type="dxa" w:w="110"/>
+            </w:tcMar>
+            <w:vAlign w:val="center"/>
+          </w:tcPr>
+          <w:p>
+            <w:pPr>
+              <w:spacing w:after="0"/>
+            </w:pPr>
+            <w:r>
+              <w:rPr>
+                <w:rFonts w:ascii="Arial" w:cs="Arial" w:eastAsia="Arial" w:hAnsi="Arial"/>
+                <w:b w:val="false"/>
+                <w:bCs w:val="false"/>
+                <w:color w:val="1F2937"/>
+                <w:sz w:val="18"/>
+                <w:szCs w:val="18"/>
+              </w:rPr>
+              <w:t xml:space="preserve">under_review</w:t>
+            </w:r>
+          </w:p>
+        </w:tc>
+      </w:tr>
+      <w:tr>
+        <w:tc>
+          <w:tcPr>
+            <w:tcW w:type="dxa" w:w="1900"/>
+            <w:tcBorders>
+              <w:top w:val="single" w:color="D8DEDA" w:sz="2"/>
+              <w:left w:val="single" w:color="D8DEDA" w:sz="2"/>
+              <w:bottom w:val="single" w:color="D8DEDA" w:sz="2"/>
+              <w:right w:val="single" w:color="D8DEDA" w:sz="2"/>
+            </w:tcBorders>
+            <w:shd w:fill="FFFFFF" w:val="clear"/>
+            <w:tcMar>
+              <w:top w:type="dxa" w:w="70"/>
+              <w:left w:type="dxa" w:w="110"/>
+              <w:bottom w:type="dxa" w:w="70"/>
+              <w:right w:type="dxa" w:w="110"/>
+            </w:tcMar>
+            <w:vAlign w:val="center"/>
+          </w:tcPr>
+          <w:p>
+            <w:pPr>
+              <w:spacing w:after="0"/>
+            </w:pPr>
+            <w:r>
+              <w:rPr>
+                <w:rFonts w:ascii="Arial" w:cs="Arial" w:eastAsia="Arial" w:hAnsi="Arial"/>
+                <w:b w:val="false"/>
+                <w:bCs w:val="false"/>
+                <w:color w:val="1F2937"/>
+                <w:sz w:val="18"/>
+                <w:szCs w:val="18"/>
+              </w:rPr>
+              <w:t xml:space="preserve">Revisions</w:t>
+            </w:r>
+          </w:p>
+        </w:tc>
+        <w:tc>
+          <w:tcPr>
+            <w:tcW w:type="dxa" w:w="3900"/>
+            <w:tcBorders>
+              <w:top w:val="single" w:color="D8DEDA" w:sz="2"/>
+              <w:left w:val="single" w:color="D8DEDA" w:sz="2"/>
+              <w:bottom w:val="single" w:color="D8DEDA" w:sz="2"/>
+              <w:right w:val="single" w:color="D8DEDA" w:sz="2"/>
+            </w:tcBorders>
+            <w:shd w:fill="FFFFFF" w:val="clear"/>
+            <w:tcMar>
+              <w:top w:type="dxa" w:w="70"/>
+              <w:left w:type="dxa" w:w="110"/>
+              <w:bottom w:type="dxa" w:w="70"/>
+              <w:right w:type="dxa" w:w="110"/>
+            </w:tcMar>
+            <w:vAlign w:val="center"/>
+          </w:tcPr>
+          <w:p>
+            <w:pPr>
+              <w:spacing w:after="0"/>
+            </w:pPr>
+            <w:r>
+              <w:rPr>
+                <w:rFonts w:ascii="Arial" w:cs="Arial" w:eastAsia="Arial" w:hAnsi="Arial"/>
+                <w:b w:val="false"/>
+                <w:bCs w:val="false"/>
+                <w:color w:val="1F2937"/>
+                <w:sz w:val="18"/>
+                <w:szCs w:val="18"/>
+              </w:rPr>
+              <w:t xml:space="preserve">Un reviewer a envoyé ses commentaires, ou l'éditeur demande des corrections</w:t>
+            </w:r>
+          </w:p>
+        </w:tc>
+        <w:tc>
+          <w:tcPr>
+            <w:tcW w:type="dxa" w:w="3226"/>
+            <w:tcBorders>
+              <w:top w:val="single" w:color="D8DEDA" w:sz="2"/>
+              <w:left w:val="single" w:color="D8DEDA" w:sz="2"/>
+              <w:bottom w:val="single" w:color="D8DEDA" w:sz="2"/>
+              <w:right w:val="single" w:color="D8DEDA" w:sz="2"/>
+            </w:tcBorders>
+            <w:shd w:fill="FFFFFF" w:val="clear"/>
+            <w:tcMar>
+              <w:top w:type="dxa" w:w="70"/>
+              <w:left w:type="dxa" w:w="110"/>
+              <w:bottom w:type="dxa" w:w="70"/>
+              <w:right w:type="dxa" w:w="110"/>
+            </w:tcMar>
+            <w:vAlign w:val="center"/>
+          </w:tcPr>
+          <w:p>
+            <w:pPr>
+              <w:spacing w:after="0"/>
+            </w:pPr>
+            <w:r>
+              <w:rPr>
+                <w:rFonts w:ascii="Arial" w:cs="Arial" w:eastAsia="Arial" w:hAnsi="Arial"/>
+                <w:b w:val="false"/>
+                <w:bCs w:val="false"/>
+                <w:color w:val="1F2937"/>
+                <w:sz w:val="18"/>
+                <w:szCs w:val="18"/>
+              </w:rPr>
+              <w:t xml:space="preserve">revision_needed, major_revision, minor_revision, sent_back, revised</w:t>
+            </w:r>
+          </w:p>
+        </w:tc>
+      </w:tr>
+      <w:tr>
+        <w:tc>
+          <w:tcPr>
+            <w:tcW w:type="dxa" w:w="1900"/>
+            <w:tcBorders>
+              <w:top w:val="single" w:color="D8DEDA" w:sz="2"/>
+              <w:left w:val="single" w:color="D8DEDA" w:sz="2"/>
+              <w:bottom w:val="single" w:color="D8DEDA" w:sz="2"/>
+              <w:right w:val="single" w:color="D8DEDA" w:sz="2"/>
+            </w:tcBorders>
+            <w:shd w:fill="F3F6F4" w:val="clear"/>
+            <w:tcMar>
+              <w:top w:type="dxa" w:w="70"/>
+              <w:left w:type="dxa" w:w="110"/>
+              <w:bottom w:type="dxa" w:w="70"/>
+              <w:right w:type="dxa" w:w="110"/>
+            </w:tcMar>
+            <w:vAlign w:val="center"/>
+          </w:tcPr>
+          <w:p>
+            <w:pPr>
+              <w:spacing w:after="0"/>
+            </w:pPr>
+            <w:r>
+              <w:rPr>
+                <w:rFonts w:ascii="Arial" w:cs="Arial" w:eastAsia="Arial" w:hAnsi="Arial"/>
+                <w:b w:val="false"/>
+                <w:bCs w:val="false"/>
+                <w:color w:val="1F2937"/>
+                <w:sz w:val="18"/>
+                <w:szCs w:val="18"/>
+              </w:rPr>
+              <w:t xml:space="preserve">Accepted</w:t>
+            </w:r>
+          </w:p>
+        </w:tc>
+        <w:tc>
+          <w:tcPr>
+            <w:tcW w:type="dxa" w:w="3900"/>
+            <w:tcBorders>
+              <w:top w:val="single" w:color="D8DEDA" w:sz="2"/>
+              <w:left w:val="single" w:color="D8DEDA" w:sz="2"/>
+              <w:bottom w:val="single" w:color="D8DEDA" w:sz="2"/>
+              <w:right w:val="single" w:color="D8DEDA" w:sz="2"/>
+            </w:tcBorders>
+            <w:shd w:fill="F3F6F4" w:val="clear"/>
+            <w:tcMar>
+              <w:top w:type="dxa" w:w="70"/>
+              <w:left w:type="dxa" w:w="110"/>
+              <w:bottom w:type="dxa" w:w="70"/>
+              <w:right w:type="dxa" w:w="110"/>
+            </w:tcMar>
+            <w:vAlign w:val="center"/>
+          </w:tcPr>
+          <w:p>
+            <w:pPr>
+              <w:spacing w:after="0"/>
+            </w:pPr>
+            <w:r>
+              <w:rPr>
+                <w:rFonts w:ascii="Arial" w:cs="Arial" w:eastAsia="Arial" w:hAnsi="Arial"/>
+                <w:b w:val="false"/>
+                <w:bCs w:val="false"/>
+                <w:color w:val="1F2937"/>
+                <w:sz w:val="18"/>
+                <w:szCs w:val="18"/>
+              </w:rPr>
+              <w:t xml:space="preserve">Décision « Accept »</w:t>
+            </w:r>
+          </w:p>
+        </w:tc>
+        <w:tc>
+          <w:tcPr>
+            <w:tcW w:type="dxa" w:w="3226"/>
+            <w:tcBorders>
+              <w:top w:val="single" w:color="D8DEDA" w:sz="2"/>
+              <w:left w:val="single" w:color="D8DEDA" w:sz="2"/>
+              <w:bottom w:val="single" w:color="D8DEDA" w:sz="2"/>
+              <w:right w:val="single" w:color="D8DEDA" w:sz="2"/>
+            </w:tcBorders>
+            <w:shd w:fill="F3F6F4" w:val="clear"/>
+            <w:tcMar>
+              <w:top w:type="dxa" w:w="70"/>
+              <w:left w:type="dxa" w:w="110"/>
+              <w:bottom w:type="dxa" w:w="70"/>
+              <w:right w:type="dxa" w:w="110"/>
+            </w:tcMar>
+            <w:vAlign w:val="center"/>
+          </w:tcPr>
+          <w:p>
+            <w:pPr>
+              <w:spacing w:after="0"/>
+            </w:pPr>
+            <w:r>
+              <w:rPr>
+                <w:rFonts w:ascii="Arial" w:cs="Arial" w:eastAsia="Arial" w:hAnsi="Arial"/>
+                <w:b w:val="false"/>
+                <w:bCs w:val="false"/>
+                <w:color w:val="1F2937"/>
+                <w:sz w:val="18"/>
+                <w:szCs w:val="18"/>
+              </w:rPr>
+              <w:t xml:space="preserve">accepted</w:t>
+            </w:r>
+          </w:p>
+        </w:tc>
+      </w:tr>
+      <w:tr>
+        <w:tc>
+          <w:tcPr>
+            <w:tcW w:type="dxa" w:w="1900"/>
+            <w:tcBorders>
+              <w:top w:val="single" w:color="D8DEDA" w:sz="2"/>
+              <w:left w:val="single" w:color="D8DEDA" w:sz="2"/>
+              <w:bottom w:val="single" w:color="D8DEDA" w:sz="2"/>
+              <w:right w:val="single" w:color="D8DEDA" w:sz="2"/>
+            </w:tcBorders>
+            <w:shd w:fill="FFFFFF" w:val="clear"/>
+            <w:tcMar>
+              <w:top w:type="dxa" w:w="70"/>
+              <w:left w:type="dxa" w:w="110"/>
+              <w:bottom w:type="dxa" w:w="70"/>
+              <w:right w:type="dxa" w:w="110"/>
+            </w:tcMar>
+            <w:vAlign w:val="center"/>
+          </w:tcPr>
+          <w:p>
+            <w:pPr>
+              <w:spacing w:after="0"/>
+            </w:pPr>
+            <w:r>
+              <w:rPr>
+                <w:rFonts w:ascii="Arial" w:cs="Arial" w:eastAsia="Arial" w:hAnsi="Arial"/>
+                <w:b w:val="false"/>
+                <w:bCs w:val="false"/>
+                <w:color w:val="1F2937"/>
+                <w:sz w:val="18"/>
+                <w:szCs w:val="18"/>
+              </w:rPr>
+              <w:t xml:space="preserve">Published</w:t>
+            </w:r>
+          </w:p>
+        </w:tc>
+        <w:tc>
+          <w:tcPr>
+            <w:tcW w:type="dxa" w:w="3900"/>
+            <w:tcBorders>
+              <w:top w:val="single" w:color="D8DEDA" w:sz="2"/>
+              <w:left w:val="single" w:color="D8DEDA" w:sz="2"/>
+              <w:bottom w:val="single" w:color="D8DEDA" w:sz="2"/>
+              <w:right w:val="single" w:color="D8DEDA" w:sz="2"/>
+            </w:tcBorders>
+            <w:shd w:fill="FFFFFF" w:val="clear"/>
+            <w:tcMar>
+              <w:top w:type="dxa" w:w="70"/>
+              <w:left w:type="dxa" w:w="110"/>
+              <w:bottom w:type="dxa" w:w="70"/>
+              <w:right w:type="dxa" w:w="110"/>
+            </w:tcMar>
+            <w:vAlign w:val="center"/>
+          </w:tcPr>
+          <w:p>
+            <w:pPr>
+              <w:spacing w:after="0"/>
+            </w:pPr>
+            <w:r>
+              <w:rPr>
+                <w:rFonts w:ascii="Arial" w:cs="Arial" w:eastAsia="Arial" w:hAnsi="Arial"/>
+                <w:b w:val="false"/>
+                <w:bCs w:val="false"/>
+                <w:color w:val="1F2937"/>
+                <w:sz w:val="18"/>
+                <w:szCs w:val="18"/>
+              </w:rPr>
+              <w:t xml:space="preserve">Publication sur le site</w:t>
+            </w:r>
+          </w:p>
+        </w:tc>
+        <w:tc>
+          <w:tcPr>
+            <w:tcW w:type="dxa" w:w="3226"/>
+            <w:tcBorders>
+              <w:top w:val="single" w:color="D8DEDA" w:sz="2"/>
+              <w:left w:val="single" w:color="D8DEDA" w:sz="2"/>
+              <w:bottom w:val="single" w:color="D8DEDA" w:sz="2"/>
+              <w:right w:val="single" w:color="D8DEDA" w:sz="2"/>
+            </w:tcBorders>
+            <w:shd w:fill="FFFFFF" w:val="clear"/>
+            <w:tcMar>
+              <w:top w:type="dxa" w:w="70"/>
+              <w:left w:type="dxa" w:w="110"/>
+              <w:bottom w:type="dxa" w:w="70"/>
+              <w:right w:type="dxa" w:w="110"/>
+            </w:tcMar>
+            <w:vAlign w:val="center"/>
+          </w:tcPr>
+          <w:p>
+            <w:pPr>
+              <w:spacing w:after="0"/>
+            </w:pPr>
+            <w:r>
+              <w:rPr>
+                <w:rFonts w:ascii="Arial" w:cs="Arial" w:eastAsia="Arial" w:hAnsi="Arial"/>
+                <w:b w:val="false"/>
+                <w:bCs w:val="false"/>
+                <w:color w:val="1F2937"/>
+                <w:sz w:val="18"/>
+                <w:szCs w:val="18"/>
+              </w:rPr>
+              <w:t xml:space="preserve">published</w:t>
+            </w:r>
+          </w:p>
+        </w:tc>
+      </w:tr>
+      <w:tr>
+        <w:tc>
+          <w:tcPr>
+            <w:tcW w:type="dxa" w:w="1900"/>
+            <w:tcBorders>
+              <w:top w:val="single" w:color="D8DEDA" w:sz="2"/>
+              <w:left w:val="single" w:color="D8DEDA" w:sz="2"/>
+              <w:bottom w:val="single" w:color="D8DEDA" w:sz="2"/>
+              <w:right w:val="single" w:color="D8DEDA" w:sz="2"/>
+            </w:tcBorders>
+            <w:shd w:fill="F3F6F4" w:val="clear"/>
+            <w:tcMar>
+              <w:top w:type="dxa" w:w="70"/>
+              <w:left w:type="dxa" w:w="110"/>
+              <w:bottom w:type="dxa" w:w="70"/>
+              <w:right w:type="dxa" w:w="110"/>
+            </w:tcMar>
+            <w:vAlign w:val="center"/>
+          </w:tcPr>
+          <w:p>
+            <w:pPr>
+              <w:spacing w:after="0"/>
+            </w:pPr>
+            <w:r>
+              <w:rPr>
+                <w:rFonts w:ascii="Arial" w:cs="Arial" w:eastAsia="Arial" w:hAnsi="Arial"/>
+                <w:b w:val="false"/>
+                <w:bCs w:val="false"/>
+                <w:color w:val="1F2937"/>
+                <w:sz w:val="18"/>
+                <w:szCs w:val="18"/>
+              </w:rPr>
+              <w:t xml:space="preserve">Rejected</w:t>
+            </w:r>
+          </w:p>
+        </w:tc>
+        <w:tc>
+          <w:tcPr>
+            <w:tcW w:type="dxa" w:w="3900"/>
+            <w:tcBorders>
+              <w:top w:val="single" w:color="D8DEDA" w:sz="2"/>
+              <w:left w:val="single" w:color="D8DEDA" w:sz="2"/>
+              <w:bottom w:val="single" w:color="D8DEDA" w:sz="2"/>
+              <w:right w:val="single" w:color="D8DEDA" w:sz="2"/>
+            </w:tcBorders>
+            <w:shd w:fill="F3F6F4" w:val="clear"/>
+            <w:tcMar>
+              <w:top w:type="dxa" w:w="70"/>
+              <w:left w:type="dxa" w:w="110"/>
+              <w:bottom w:type="dxa" w:w="70"/>
+              <w:right w:type="dxa" w:w="110"/>
+            </w:tcMar>
+            <w:vAlign w:val="center"/>
+          </w:tcPr>
+          <w:p>
+            <w:pPr>
+              <w:spacing w:after="0"/>
+            </w:pPr>
+            <w:r>
+              <w:rPr>
+                <w:rFonts w:ascii="Arial" w:cs="Arial" w:eastAsia="Arial" w:hAnsi="Arial"/>
+                <w:b w:val="false"/>
+                <w:bCs w:val="false"/>
+                <w:color w:val="1F2937"/>
+                <w:sz w:val="18"/>
+                <w:szCs w:val="18"/>
+              </w:rPr>
+              <w:t xml:space="preserve">Décision « Reject »</w:t>
+            </w:r>
+          </w:p>
+        </w:tc>
+        <w:tc>
+          <w:tcPr>
+            <w:tcW w:type="dxa" w:w="3226"/>
+            <w:tcBorders>
+              <w:top w:val="single" w:color="D8DEDA" w:sz="2"/>
+              <w:left w:val="single" w:color="D8DEDA" w:sz="2"/>
+              <w:bottom w:val="single" w:color="D8DEDA" w:sz="2"/>
+              <w:right w:val="single" w:color="D8DEDA" w:sz="2"/>
+            </w:tcBorders>
+            <w:shd w:fill="F3F6F4" w:val="clear"/>
+            <w:tcMar>
+              <w:top w:type="dxa" w:w="70"/>
+              <w:left w:type="dxa" w:w="110"/>
+              <w:bottom w:type="dxa" w:w="70"/>
+              <w:right w:type="dxa" w:w="110"/>
+            </w:tcMar>
+            <w:vAlign w:val="center"/>
+          </w:tcPr>
+          <w:p>
+            <w:pPr>
+              <w:spacing w:after="0"/>
+            </w:pPr>
+            <w:r>
+              <w:rPr>
+                <w:rFonts w:ascii="Arial" w:cs="Arial" w:eastAsia="Arial" w:hAnsi="Arial"/>
+                <w:b w:val="false"/>
+                <w:bCs w:val="false"/>
+                <w:color w:val="1F2937"/>
+                <w:sz w:val="18"/>
+                <w:szCs w:val="18"/>
+              </w:rPr>
+              <w:t xml:space="preserve">rejected</w:t>
+            </w:r>
+          </w:p>
+        </w:tc>
+      </w:tr>
+    </w:tbl>
+    <w:p>
+      <w:pPr>
+        <w:spacing w:after="200"/>
+      </w:pPr>
+    </w:p>
+    <w:p>
+      <w:pPr>
         <w:spacing w:after="40"/>
       </w:pPr>
     </w:p>
@@ -6585,7 +7446,7 @@
           <w:sz w:val="17"/>
           <w:szCs w:val="17"/>
         </w:rPr>
-        <w:t xml:space="preserve">   Auteur ----&gt; [ pending ]   soumission déposée</w:t>
+        <w:t xml:space="preserve"> Auteur --&gt; submitted --(un reviewer ACCEPTE)--&gt; under_review</w:t>
       </w:r>
     </w:p>
     <w:p>
@@ -6601,7 +7462,7 @@
           <w:sz w:val="17"/>
           <w:szCs w:val="17"/>
         </w:rPr>
-        <w:t xml:space="preserve">                    |  examen initial par l'administration</w:t>
+        <w:t xml:space="preserve">               |                                     |</w:t>
       </w:r>
     </w:p>
     <w:p>
@@ -6617,7 +7478,7 @@
           <w:sz w:val="17"/>
           <w:szCs w:val="17"/>
         </w:rPr>
-        <w:t xml:space="preserve">      +-------------+--------------+</w:t>
+        <w:t xml:space="preserve">               | Send back (format)                  | un reviewer ENVOIE ses commentaires</w:t>
       </w:r>
     </w:p>
     <w:p>
@@ -6633,7 +7494,7 @@
           <w:sz w:val="17"/>
           <w:szCs w:val="17"/>
         </w:rPr>
-        <w:t xml:space="preserve">      v             v              v</w:t>
+        <w:t xml:space="preserve">               v                                     v</w:t>
       </w:r>
     </w:p>
     <w:p>
@@ -6649,7 +7510,7 @@
           <w:sz w:val="17"/>
           <w:szCs w:val="17"/>
         </w:rPr>
-        <w:t xml:space="preserve"> [ sent_back ] [ under_review ] [ rejected ]</w:t>
+        <w:t xml:space="preserve">           sent_back                          revision_needed</w:t>
       </w:r>
     </w:p>
     <w:p>
@@ -6665,7 +7526,7 @@
           <w:sz w:val="17"/>
           <w:szCs w:val="17"/>
         </w:rPr>
-        <w:t xml:space="preserve">  format non    reviewers</w:t>
+        <w:t xml:space="preserve">               |                                     | décision de l'éditeur</w:t>
       </w:r>
     </w:p>
     <w:p>
@@ -6681,7 +7542,7 @@
           <w:sz w:val="17"/>
           <w:szCs w:val="17"/>
         </w:rPr>
-        <w:t xml:space="preserve">  conforme      assignés</w:t>
+        <w:t xml:space="preserve">               |               +---------------------+--------------------+</w:t>
       </w:r>
     </w:p>
     <w:p>
@@ -6697,7 +7558,7 @@
           <w:sz w:val="17"/>
           <w:szCs w:val="17"/>
         </w:rPr>
-        <w:t xml:space="preserve">                    |  évaluations reçues, décision</w:t>
+        <w:t xml:space="preserve">               |               v                     v                    v</w:t>
       </w:r>
     </w:p>
     <w:p>
@@ -6713,7 +7574,7 @@
           <w:sz w:val="17"/>
           <w:szCs w:val="17"/>
         </w:rPr>
-        <w:t xml:space="preserve">      +-------+-----+-----+---------+</w:t>
+        <w:t xml:space="preserve">               |      major / minor_revision      accepted             rejected</w:t>
       </w:r>
     </w:p>
     <w:p>
@@ -6729,7 +7590,7 @@
           <w:sz w:val="17"/>
           <w:szCs w:val="17"/>
         </w:rPr>
-        <w:t xml:space="preserve">      v       v           v         v</w:t>
+        <w:t xml:space="preserve">               |               |                     |</w:t>
       </w:r>
     </w:p>
     <w:p>
@@ -6745,7 +7606,7 @@
           <w:sz w:val="17"/>
           <w:szCs w:val="17"/>
         </w:rPr>
-        <w:t xml:space="preserve"> [ minor_ ] [ major_ ] [ accepted ] [ rejected ]</w:t>
+        <w:t xml:space="preserve">               +-------+-------+                     | APC réglée + PDF déposé</w:t>
       </w:r>
     </w:p>
     <w:p>
@@ -6761,7 +7622,7 @@
           <w:sz w:val="17"/>
           <w:szCs w:val="17"/>
         </w:rPr>
-        <w:t xml:space="preserve"> [revision] [revision]      |</w:t>
+        <w:t xml:space="preserve">                       v                             v</w:t>
       </w:r>
     </w:p>
     <w:p>
@@ -6777,7 +7638,7 @@
           <w:sz w:val="17"/>
           <w:szCs w:val="17"/>
         </w:rPr>
-        <w:t xml:space="preserve">      +----+----+           |  frais de publication réglés</w:t>
+        <w:t xml:space="preserve">        version révisée déposée par l'auteur     published</w:t>
       </w:r>
     </w:p>
     <w:p>
@@ -6793,7 +7654,7 @@
           <w:sz w:val="17"/>
           <w:szCs w:val="17"/>
         </w:rPr>
-        <w:t xml:space="preserve">           v                v</w:t>
+        <w:t xml:space="preserve">                       v</w:t>
       </w:r>
     </w:p>
     <w:p>
@@ -6809,7 +7670,7 @@
           <w:sz w:val="17"/>
           <w:szCs w:val="17"/>
         </w:rPr>
-        <w:t xml:space="preserve">      [ revised ] ---&gt; [ published ]</w:t>
+        <w:t xml:space="preserve">                    revised --(nouvelle acceptation)--&gt; under_review</w:t>
       </w:r>
     </w:p>
     <w:p>
@@ -6841,7 +7702,7 @@
           <w:sz w:val="17"/>
           <w:szCs w:val="17"/>
         </w:rPr>
-        <w:t xml:space="preserve">  withdrawn : retrait par l'auteur, possible avant décision finale</w:t>
+        <w:t xml:space="preserve">  withdrawn : retrait à l'initiative de l'auteur</w:t>
       </w:r>
     </w:p>
     <w:p>
@@ -6851,8 +7712,12 @@
     </w:p>
     <w:p>
       <w:pPr>
-        <w:spacing w:after="130"/>
-        <w:jc w:val="both"/>
+        <w:pStyle w:val="ListParagraph"/>
+        <w:numPr>
+          <w:ilvl w:val="0"/>
+          <w:numId w:val="2"/>
+        </w:numPr>
+        <w:spacing w:after="70"/>
       </w:pPr>
       <w:r>
         <w:rPr>
@@ -6860,21 +7725,17 @@
           <w:sz w:val="21"/>
           <w:szCs w:val="21"/>
         </w:rPr>
-        <w:t xml:space="preserve">Chaque changement de statut déclenche un email à l'auteur et une notification interne. Les libellés transmis à l'auteur sont ceux retenus par le comité : Accept, Reject, Major revision, Minor revision, Revision requested, Sent back to the authors.</w:t>
-      </w:r>
-    </w:p>
-    <w:p>
-      <w:pPr>
-        <w:pStyle w:val="Heading2"/>
-      </w:pPr>
-      <w:r>
-        <w:t xml:space="preserve">5.2 Règle de publication</w:t>
-      </w:r>
-    </w:p>
-    <w:p>
-      <w:pPr>
-        <w:spacing w:after="130"/>
-        <w:jc w:val="both"/>
+        <w:t xml:space="preserve">Inviter un reviewer ne change pas le statut : c'est son acceptation qui fait passer l'article « Under review ».</w:t>
+      </w:r>
+    </w:p>
+    <w:p>
+      <w:pPr>
+        <w:pStyle w:val="ListParagraph"/>
+        <w:numPr>
+          <w:ilvl w:val="0"/>
+          <w:numId w:val="2"/>
+        </w:numPr>
+        <w:spacing w:after="70"/>
       </w:pPr>
       <w:r>
         <w:rPr>
@@ -6882,7 +7743,44 @@
           <w:sz w:val="21"/>
           <w:szCs w:val="21"/>
         </w:rPr>
-        <w:t xml:space="preserve">Un article ne peut pas être publié tant que les frais de publication ne sont pas constatés : la demande est refusée par le serveur. Ce verrou est absolu et ne peut être contourné depuis l'interface.</w:t>
+        <w:t xml:space="preserve">Les premiers commentaires reçus font passer l'article dans « Revisions ». Une décision déjà prise par l'éditeur n'est jamais écrasée.</w:t>
+      </w:r>
+    </w:p>
+    <w:p>
+      <w:pPr>
+        <w:pStyle w:val="ListParagraph"/>
+        <w:numPr>
+          <w:ilvl w:val="0"/>
+          <w:numId w:val="2"/>
+        </w:numPr>
+        <w:spacing w:after="70"/>
+      </w:pPr>
+      <w:r>
+        <w:rPr>
+          <w:rFonts w:ascii="Arial" w:cs="Arial" w:eastAsia="Arial" w:hAnsi="Arial"/>
+          <w:sz w:val="21"/>
+          <w:szCs w:val="21"/>
+        </w:rPr>
+        <w:t xml:space="preserve">Chaque reviewer garde l'accès à son évaluation tant qu'il ne l'a pas rendue, même si un autre reviewer a déjà rendu la sienne.</w:t>
+      </w:r>
+    </w:p>
+    <w:p>
+      <w:pPr>
+        <w:spacing w:after="100"/>
+      </w:pPr>
+    </w:p>
+    <w:p>
+      <w:pPr>
+        <w:spacing w:after="130"/>
+        <w:jc w:val="both"/>
+      </w:pPr>
+      <w:r>
+        <w:rPr>
+          <w:rFonts w:ascii="Arial" w:cs="Arial" w:eastAsia="Arial" w:hAnsi="Arial"/>
+          <w:sz w:val="21"/>
+          <w:szCs w:val="21"/>
+        </w:rPr>
+        <w:t xml:space="preserve">Chaque décision déclenche un email à l'auteur et une notification interne. Les libellés transmis à l'auteur sont ceux retenus par le comité : Accept, Reject, Major revision, Minor revision, Revision requested, Sent back to the authors.</w:t>
       </w:r>
     </w:p>
     <w:p>
@@ -6890,7 +7788,29 @@
         <w:pStyle w:val="Heading2"/>
       </w:pPr>
       <w:r>
-        <w:t xml:space="preserve">5.3 Parcours d'évaluation</w:t>
+        <w:t xml:space="preserve">5.2 Règle de publication</w:t>
+      </w:r>
+    </w:p>
+    <w:p>
+      <w:pPr>
+        <w:spacing w:after="130"/>
+        <w:jc w:val="both"/>
+      </w:pPr>
+      <w:r>
+        <w:rPr>
+          <w:rFonts w:ascii="Arial" w:cs="Arial" w:eastAsia="Arial" w:hAnsi="Arial"/>
+          <w:sz w:val="21"/>
+          <w:szCs w:val="21"/>
+        </w:rPr>
+        <w:t xml:space="preserve">Un article ne peut pas être publié tant que deux conditions ne sont pas remplies : les frais de publication sont constatés, et le PDF mis en page par la maison d'édition a été déposé. Un article publié est ainsi toujours servi en PDF, jamais en Word. Le serveur refuse la publication dans le cas contraire : ce verrou ne peut être contourné depuis l'interface.</w:t>
+      </w:r>
+    </w:p>
+    <w:p>
+      <w:pPr>
+        <w:pStyle w:val="Heading2"/>
+      </w:pPr>
+      <w:r>
+        <w:t xml:space="preserve">5.3 Parcours d'évaluation et communication avec l'auteur</w:t>
       </w:r>
     </w:p>
     <w:p>
@@ -6944,7 +7864,7 @@
           <w:sz w:val="21"/>
           <w:szCs w:val="21"/>
         </w:rPr>
-        <w:t xml:space="preserve">L'invitation contient deux liens signés par un jeton à usage unique : l'expert accepte ou décline sans avoir à créer de compte ni à se connecter.</w:t>
+        <w:t xml:space="preserve">L'invitation contient deux liens signés par un jeton à usage unique. Après acceptation, le reviewer est conduit directement à sa page « Articles to review ».</w:t>
       </w:r>
     </w:p>
     <w:p>
@@ -6962,7 +7882,7 @@
           <w:sz w:val="21"/>
           <w:szCs w:val="21"/>
         </w:rPr>
-        <w:t xml:space="preserve">Le reviewer dépose son évaluation : commentaires destinés à l'auteur, commentaires confidentiels réservés à l'éditeur, recommandation et, si besoin, un fichier annoté.</w:t>
+        <w:t xml:space="preserve">Le reviewer dépose son évaluation : commentaires, commentaires confidentiels réservés à l'éditeur, recommandation et, si besoin, un fichier annoté.</w:t>
       </w:r>
     </w:p>
     <w:p>
@@ -6980,7 +7900,25 @@
           <w:sz w:val="21"/>
           <w:szCs w:val="21"/>
         </w:rPr>
-        <w:t xml:space="preserve">L'éditeur et l'administration sont alertés. La décision finale est notifiée à l'auteur et, pour information, aux reviewers.</w:t>
+        <w:t xml:space="preserve">L'auteur ne voit jamais les commentaires des reviewers. L'éditeur lui écrit dans la fenêtre « Editor comments » : message seul, ou message joint à une décision. Ce fil est le seul contenu éditorial visible par l'auteur, sur sa plateforme comme dans ses emails.</w:t>
+      </w:r>
+    </w:p>
+    <w:p>
+      <w:pPr>
+        <w:pStyle w:val="ListParagraph"/>
+        <w:numPr>
+          <w:ilvl w:val="0"/>
+          <w:numId w:val="3"/>
+        </w:numPr>
+        <w:spacing w:after="70"/>
+      </w:pPr>
+      <w:r>
+        <w:rPr>
+          <w:rFonts w:ascii="Arial" w:cs="Arial" w:eastAsia="Arial" w:hAnsi="Arial"/>
+          <w:sz w:val="21"/>
+          <w:szCs w:val="21"/>
+        </w:rPr>
+        <w:t xml:space="preserve">L'auteur dépose sa version révisée : réponse aux reviewers, manuscrit révisé en version propre, manuscrit avec suivi des modifications, et autres documents. L'équipe éditoriale est alertée, puis relance une évaluation ou décide directement.</w:t>
       </w:r>
     </w:p>
     <w:p>
@@ -7406,14 +8344,6 @@
     </w:p>
     <w:p>
       <w:pPr>
-        <w:pStyle w:val="Heading2"/>
-      </w:pPr>
-      <w:r>
-        <w:t xml:space="preserve">6.3 Protection des fichiers</w:t>
-      </w:r>
-    </w:p>
-    <w:p>
-      <w:pPr>
         <w:spacing w:after="130"/>
         <w:jc w:val="both"/>
       </w:pPr>
@@ -7423,7 +8353,7 @@
           <w:sz w:val="21"/>
           <w:szCs w:val="21"/>
         </w:rPr>
-        <w:t xml:space="preserve">Les manuscrits non publiés sont servis derrière un contrôle d'accès qui :</w:t>
+        <w:t xml:space="preserve">La confidentialité de l'évaluation est imposée par le serveur, et pas seulement à l'affichage :</w:t>
       </w:r>
     </w:p>
     <w:p>
@@ -7441,7 +8371,7 @@
           <w:sz w:val="21"/>
           <w:szCs w:val="21"/>
         </w:rPr>
-        <w:t xml:space="preserve">rejette tout nom de fichier hors d'un format strict, ce qui interdit la remontée dans l'arborescence du serveur ;</w:t>
+        <w:t xml:space="preserve">l'auteur ne reçoit des évaluations que leur avancement : ni commentaire, ni recommandation, ni fichier annoté ;</w:t>
       </w:r>
     </w:p>
     <w:p>
@@ -7459,7 +8389,7 @@
           <w:sz w:val="21"/>
           <w:szCs w:val="21"/>
         </w:rPr>
-        <w:t xml:space="preserve">laisse passer librement les manuscrits des articles publiés ;</w:t>
+        <w:t xml:space="preserve">les commentaires confidentiels et l'identité des reviewers ne sont servis qu'à l'administration ;</w:t>
       </w:r>
     </w:p>
     <w:p>
@@ -7477,7 +8407,29 @@
           <w:sz w:val="21"/>
           <w:szCs w:val="21"/>
         </w:rPr>
-        <w:t xml:space="preserve">exige sinon un jeton valide et n'autorise que l'administration, l'auteur de la soumission, ou un reviewer effectivement assigné, vérifié en base ;</w:t>
+        <w:t xml:space="preserve">les messages de l'éditeur à l'auteur ne sont servis qu'à l'administration et à l'auteur du manuscrit, jamais aux reviewers.</w:t>
+      </w:r>
+    </w:p>
+    <w:p>
+      <w:pPr>
+        <w:pStyle w:val="Heading2"/>
+      </w:pPr>
+      <w:r>
+        <w:t xml:space="preserve">6.3 Protection des fichiers</w:t>
+      </w:r>
+    </w:p>
+    <w:p>
+      <w:pPr>
+        <w:spacing w:after="130"/>
+        <w:jc w:val="both"/>
+      </w:pPr>
+      <w:r>
+        <w:rPr>
+          <w:rFonts w:ascii="Arial" w:cs="Arial" w:eastAsia="Arial" w:hAnsi="Arial"/>
+          <w:sz w:val="21"/>
+          <w:szCs w:val="21"/>
+        </w:rPr>
+        <w:t xml:space="preserve">Les manuscrits non publiés sont servis derrière un contrôle d'accès qui :</w:t>
       </w:r>
     </w:p>
     <w:p>
@@ -7495,7 +8447,90 @@
           <w:sz w:val="21"/>
           <w:szCs w:val="21"/>
         </w:rPr>
+        <w:t xml:space="preserve">rejette tout nom de fichier hors d'un format strict, ce qui interdit la remontée dans l'arborescence du serveur ;</w:t>
+      </w:r>
+    </w:p>
+    <w:p>
+      <w:pPr>
+        <w:pStyle w:val="ListParagraph"/>
+        <w:numPr>
+          <w:ilvl w:val="0"/>
+          <w:numId w:val="2"/>
+        </w:numPr>
+        <w:spacing w:after="70"/>
+      </w:pPr>
+      <w:r>
+        <w:rPr>
+          <w:rFonts w:ascii="Arial" w:cs="Arial" w:eastAsia="Arial" w:hAnsi="Arial"/>
+          <w:sz w:val="21"/>
+          <w:szCs w:val="21"/>
+        </w:rPr>
+        <w:t xml:space="preserve">laisse passer librement les manuscrits des articles publiés ;</w:t>
+      </w:r>
+    </w:p>
+    <w:p>
+      <w:pPr>
+        <w:pStyle w:val="ListParagraph"/>
+        <w:numPr>
+          <w:ilvl w:val="0"/>
+          <w:numId w:val="2"/>
+        </w:numPr>
+        <w:spacing w:after="70"/>
+      </w:pPr>
+      <w:r>
+        <w:rPr>
+          <w:rFonts w:ascii="Arial" w:cs="Arial" w:eastAsia="Arial" w:hAnsi="Arial"/>
+          <w:sz w:val="21"/>
+          <w:szCs w:val="21"/>
+        </w:rPr>
+        <w:t xml:space="preserve">exige sinon un jeton valide et n'autorise que l'administration, l'auteur de la soumission, ou un reviewer effectivement assigné, vérifié en base ;</w:t>
+      </w:r>
+    </w:p>
+    <w:p>
+      <w:pPr>
+        <w:pStyle w:val="ListParagraph"/>
+        <w:numPr>
+          <w:ilvl w:val="0"/>
+          <w:numId w:val="2"/>
+        </w:numPr>
+        <w:spacing w:after="70"/>
+      </w:pPr>
+      <w:r>
+        <w:rPr>
+          <w:rFonts w:ascii="Arial" w:cs="Arial" w:eastAsia="Arial" w:hAnsi="Arial"/>
+          <w:sz w:val="21"/>
+          <w:szCs w:val="21"/>
+        </w:rPr>
         <w:t xml:space="preserve">refuse l'accès dans tous les autres cas.</w:t>
+      </w:r>
+    </w:p>
+    <w:p>
+      <w:pPr>
+        <w:pBdr>
+          <w:left w:val="single" w:color="2E9E68" w:sz="12" w:space="8"/>
+        </w:pBdr>
+        <w:spacing w:after="180" w:before="100"/>
+        <w:ind w:left="260"/>
+      </w:pPr>
+      <w:r>
+        <w:rPr>
+          <w:rFonts w:ascii="Arial" w:cs="Arial" w:eastAsia="Arial" w:hAnsi="Arial"/>
+          <w:b/>
+          <w:bCs/>
+          <w:color w:val="1B4427"/>
+          <w:sz w:val="19"/>
+          <w:szCs w:val="19"/>
+        </w:rPr>
+        <w:t xml:space="preserve">Note — </w:t>
+      </w:r>
+      <w:r>
+        <w:rPr>
+          <w:rFonts w:ascii="Arial" w:cs="Arial" w:eastAsia="Arial" w:hAnsi="Arial"/>
+          <w:color w:val="4B5563"/>
+          <w:sz w:val="19"/>
+          <w:szCs w:val="19"/>
+        </w:rPr>
+        <w:t xml:space="preserve">En production, tous les liens de fichiers du site passent par un relais du serveur, qui impose le bon type de fichier et un nom propre. Le compte gratuit du service de stockage bloque la diffusion publique des PDF : le relais les récupère alors par l'interface authentifiée du service. Aucun lien du site ne doit pointer directement vers le service de stockage.</w:t>
       </w:r>
     </w:p>
     <w:p>
@@ -8567,7 +9602,7 @@
           <w:sz w:val="21"/>
           <w:szCs w:val="21"/>
         </w:rPr>
-        <w:t xml:space="preserve">La plateforme expose une interface REST de 62 points d'entrée, répartis en onze groupes fonctionnels. Le détail complet — paramètres, corps de requête, réponses, codes d'erreur — figure dans le document API.md livré avec le code source.</w:t>
+        <w:t xml:space="preserve">La plateforme expose une interface REST de 64 points d'entrée, répartis en onze groupes fonctionnels. Le détail complet — paramètres, corps de requête, réponses, codes d'erreur — figure dans le document API.md livré avec le code source.</w:t>
       </w:r>
     </w:p>
     <w:tbl>
@@ -8978,7 +10013,7 @@
                 <w:sz w:val="18"/>
                 <w:szCs w:val="18"/>
               </w:rPr>
-              <w:t xml:space="preserve">10</w:t>
+              <w:t xml:space="preserve">12</w:t>
             </w:r>
           </w:p>
         </w:tc>
@@ -9013,7 +10048,7 @@
                 <w:sz w:val="18"/>
                 <w:szCs w:val="18"/>
               </w:rPr>
-              <w:t xml:space="preserve">Dépôt et suivi des manuscrits</w:t>
+              <w:t xml:space="preserve">Dépôt et suivi des manuscrits, messages de l'éditeur, versions révisées</w:t>
             </w:r>
           </w:p>
         </w:tc>
@@ -14587,6 +15622,42 @@
     </w:p>
     <w:p>
       <w:pPr>
+        <w:spacing w:after="130"/>
+        <w:jc w:val="both"/>
+      </w:pPr>
+      <w:r>
+        <w:rPr>
+          <w:rFonts w:ascii="Arial" w:cs="Arial" w:eastAsia="Arial" w:hAnsi="Arial"/>
+          <w:sz w:val="21"/>
+          <w:szCs w:val="21"/>
+        </w:rPr>
+        <w:t xml:space="preserve">Tout nouveau statut de manuscrit doit aussi être rangé dans l'une des six étapes de l'espace auteur (fichier de regroupement des statuts du frontend), faute de quoi l'article n'apparaîtrait dans aucun onglet.</w:t>
+      </w:r>
+    </w:p>
+    <w:p>
+      <w:pPr>
+        <w:pStyle w:val="Heading2"/>
+      </w:pPr>
+      <w:r>
+        <w:t xml:space="preserve">10.7 Supprimer un compte éditeur</w:t>
+      </w:r>
+    </w:p>
+    <w:p>
+      <w:pPr>
+        <w:spacing w:after="130"/>
+        <w:jc w:val="both"/>
+      </w:pPr>
+      <w:r>
+        <w:rPr>
+          <w:rFonts w:ascii="Arial" w:cs="Arial" w:eastAsia="Arial" w:hAnsi="Arial"/>
+          <w:sz w:val="21"/>
+          <w:szCs w:val="21"/>
+        </w:rPr>
+        <w:t xml:space="preserve">Le lien entre une soumission et son éditeur en charge ne porte pas de règle de suppression : la suppression d'un administrateur désigné éditeur d'un manuscrit échoue. Réassigner d'abord ses manuscrits à un autre éditeur, ou ajouter une règle de mise à vide dans le module d'initialisation de la base.</w:t>
+      </w:r>
+    </w:p>
+    <w:p>
+      <w:pPr>
         <w:pStyle w:val="Heading1"/>
         <w:pageBreakBefore/>
       </w:pPr>
@@ -15537,7 +16608,7 @@
                 <w:sz w:val="18"/>
                 <w:szCs w:val="18"/>
               </w:rPr>
-              <w:t xml:space="preserve">Frais de publication non constatés</w:t>
+              <w:t xml:space="preserve">Frais de publication non constatés, ou PDF de publication non déposé</w:t>
             </w:r>
           </w:p>
         </w:tc>
@@ -15572,7 +16643,7 @@
                 <w:sz w:val="18"/>
                 <w:szCs w:val="18"/>
               </w:rPr>
-              <w:t xml:space="preserve">Marquer les frais comme réglés depuis l'administration</w:t>
+              <w:t xml:space="preserve">Marquer les frais comme réglés et déposer le PDF mis en page depuis la fiche de la soumission</w:t>
             </w:r>
           </w:p>
         </w:tc>
@@ -15609,7 +16680,7 @@
                 <w:sz w:val="18"/>
                 <w:szCs w:val="18"/>
               </w:rPr>
-              <w:t xml:space="preserve">Erreur en base sur un statut nouvellement ajouté</w:t>
+              <w:t xml:space="preserve">« Upstream error » à l'ouverture d'un PDF</w:t>
             </w:r>
           </w:p>
         </w:tc>
@@ -15644,7 +16715,7 @@
                 <w:sz w:val="18"/>
                 <w:szCs w:val="18"/>
               </w:rPr>
-              <w:t xml:space="preserve">Contrainte de validation héritée non mise à jour</w:t>
+              <w:t xml:space="preserve">Le service de stockage bloque la diffusion des PDF et le relais authentifié échoue</w:t>
             </w:r>
           </w:p>
         </w:tc>
@@ -15679,7 +16750,7 @@
                 <w:sz w:val="18"/>
                 <w:szCs w:val="18"/>
               </w:rPr>
-              <w:t xml:space="preserve">Élargir la contrainte dans le module d'initialisation</w:t>
+              <w:t xml:space="preserve">Vérifier les clés du service de stockage, ou y autoriser la diffusion des PDF dans les réglages de sécurité</w:t>
             </w:r>
           </w:p>
         </w:tc>
@@ -15716,6 +16787,113 @@
                 <w:sz w:val="18"/>
                 <w:szCs w:val="18"/>
               </w:rPr>
+              <w:t xml:space="preserve">Erreur en base sur un statut nouvellement ajouté</w:t>
+            </w:r>
+          </w:p>
+        </w:tc>
+        <w:tc>
+          <w:tcPr>
+            <w:tcW w:type="dxa" w:w="2800"/>
+            <w:tcBorders>
+              <w:top w:val="single" w:color="D8DEDA" w:sz="2"/>
+              <w:left w:val="single" w:color="D8DEDA" w:sz="2"/>
+              <w:bottom w:val="single" w:color="D8DEDA" w:sz="2"/>
+              <w:right w:val="single" w:color="D8DEDA" w:sz="2"/>
+            </w:tcBorders>
+            <w:shd w:fill="F3F6F4" w:val="clear"/>
+            <w:tcMar>
+              <w:top w:type="dxa" w:w="70"/>
+              <w:left w:type="dxa" w:w="110"/>
+              <w:bottom w:type="dxa" w:w="70"/>
+              <w:right w:type="dxa" w:w="110"/>
+            </w:tcMar>
+            <w:vAlign w:val="center"/>
+          </w:tcPr>
+          <w:p>
+            <w:pPr>
+              <w:spacing w:after="0"/>
+            </w:pPr>
+            <w:r>
+              <w:rPr>
+                <w:rFonts w:ascii="Arial" w:cs="Arial" w:eastAsia="Arial" w:hAnsi="Arial"/>
+                <w:b w:val="false"/>
+                <w:bCs w:val="false"/>
+                <w:color w:val="1F2937"/>
+                <w:sz w:val="18"/>
+                <w:szCs w:val="18"/>
+              </w:rPr>
+              <w:t xml:space="preserve">Contrainte de validation héritée non mise à jour</w:t>
+            </w:r>
+          </w:p>
+        </w:tc>
+        <w:tc>
+          <w:tcPr>
+            <w:tcW w:type="dxa" w:w="3226"/>
+            <w:tcBorders>
+              <w:top w:val="single" w:color="D8DEDA" w:sz="2"/>
+              <w:left w:val="single" w:color="D8DEDA" w:sz="2"/>
+              <w:bottom w:val="single" w:color="D8DEDA" w:sz="2"/>
+              <w:right w:val="single" w:color="D8DEDA" w:sz="2"/>
+            </w:tcBorders>
+            <w:shd w:fill="F3F6F4" w:val="clear"/>
+            <w:tcMar>
+              <w:top w:type="dxa" w:w="70"/>
+              <w:left w:type="dxa" w:w="110"/>
+              <w:bottom w:type="dxa" w:w="70"/>
+              <w:right w:type="dxa" w:w="110"/>
+            </w:tcMar>
+            <w:vAlign w:val="center"/>
+          </w:tcPr>
+          <w:p>
+            <w:pPr>
+              <w:spacing w:after="0"/>
+            </w:pPr>
+            <w:r>
+              <w:rPr>
+                <w:rFonts w:ascii="Arial" w:cs="Arial" w:eastAsia="Arial" w:hAnsi="Arial"/>
+                <w:b w:val="false"/>
+                <w:bCs w:val="false"/>
+                <w:color w:val="1F2937"/>
+                <w:sz w:val="18"/>
+                <w:szCs w:val="18"/>
+              </w:rPr>
+              <w:t xml:space="preserve">Élargir la contrainte dans le module d'initialisation</w:t>
+            </w:r>
+          </w:p>
+        </w:tc>
+      </w:tr>
+      <w:tr>
+        <w:tc>
+          <w:tcPr>
+            <w:tcW w:type="dxa" w:w="3000"/>
+            <w:tcBorders>
+              <w:top w:val="single" w:color="D8DEDA" w:sz="2"/>
+              <w:left w:val="single" w:color="D8DEDA" w:sz="2"/>
+              <w:bottom w:val="single" w:color="D8DEDA" w:sz="2"/>
+              <w:right w:val="single" w:color="D8DEDA" w:sz="2"/>
+            </w:tcBorders>
+            <w:shd w:fill="FFFFFF" w:val="clear"/>
+            <w:tcMar>
+              <w:top w:type="dxa" w:w="70"/>
+              <w:left w:type="dxa" w:w="110"/>
+              <w:bottom w:type="dxa" w:w="70"/>
+              <w:right w:type="dxa" w:w="110"/>
+            </w:tcMar>
+            <w:vAlign w:val="center"/>
+          </w:tcPr>
+          <w:p>
+            <w:pPr>
+              <w:spacing w:after="0"/>
+            </w:pPr>
+            <w:r>
+              <w:rPr>
+                <w:rFonts w:ascii="Arial" w:cs="Arial" w:eastAsia="Arial" w:hAnsi="Arial"/>
+                <w:b w:val="false"/>
+                <w:bCs w:val="false"/>
+                <w:color w:val="1F2937"/>
+                <w:sz w:val="18"/>
+                <w:szCs w:val="18"/>
+              </w:rPr>
               <w:t xml:space="preserve">Le code est envoyé mais le site n'a pas changé</w:t>
             </w:r>
           </w:p>
@@ -15729,7 +16907,7 @@
               <w:bottom w:val="single" w:color="D8DEDA" w:sz="2"/>
               <w:right w:val="single" w:color="D8DEDA" w:sz="2"/>
             </w:tcBorders>
-            <w:shd w:fill="F3F6F4" w:val="clear"/>
+            <w:shd w:fill="FFFFFF" w:val="clear"/>
             <w:tcMar>
               <w:top w:type="dxa" w:w="70"/>
               <w:left w:type="dxa" w:w="110"/>
@@ -15764,7 +16942,7 @@
               <w:bottom w:val="single" w:color="D8DEDA" w:sz="2"/>
               <w:right w:val="single" w:color="D8DEDA" w:sz="2"/>
             </w:tcBorders>
-            <w:shd w:fill="F3F6F4" w:val="clear"/>
+            <w:shd w:fill="FFFFFF" w:val="clear"/>
             <w:tcMar>
               <w:top w:type="dxa" w:w="70"/>
               <w:left w:type="dxa" w:w="110"/>
@@ -17461,7 +18639,7 @@
                 <w:sz w:val="18"/>
                 <w:szCs w:val="18"/>
               </w:rPr>
-              <w:t xml:space="preserve">Référence exhaustive des 62 points d'entrée : paramètres, corps de requête, réponses, codes d'erreur, emails déclenchés</w:t>
+              <w:t xml:space="preserve">Référence exhaustive des 64 points d'entrée : paramètres, corps de requête, réponses, codes d'erreur, emails déclenchés</w:t>
             </w:r>
           </w:p>
         </w:tc>
@@ -17813,7 +18991,7 @@
         <w:sz w:val="16"/>
         <w:szCs w:val="16"/>
       </w:rPr>
-      <w:t xml:space="preserve">	Version 1.0</w:t>
+      <w:t xml:space="preserve">	Version 1.1</w:t>
     </w:r>
   </w:p>
 </w:hdr>

</xml_diff>

<commit_message>
docs: documentation technique v1.2 (remarques du 23/09)
- API.md : acces reviewer verrouille jusqu'a l'acceptation, reinvitation
  round 2+ (reviews.round), emails reviewAccepted/Declined/Reinvitation,
  decision envoyee aux co-auteurs, documents obligatoires Blinded
  Manuscript + Title page, 22 modeles d'emails
- ARCHITECTURE.md : reviews.round, double-aveugle (Title page filtree
  cote serveur), workflow corrige (statut n'avance plus tout seul a la
  reception d'un commentaire reviewer), points d'attention (liens
  ?status= vs ?tab= entre SubmissionPortal et AuthorSubmissions)
- README.md : 22 modeles d'emails
- Documentation Technique JAEI.docx regeneree (v1.2)

Co-Authored-By: Claude Opus 5 <noreply@anthropic.com>
</commit_message>
<xml_diff>
--- a/Documentation Technique JAEI.docx
+++ b/Documentation Technique JAEI.docx
@@ -328,7 +328,7 @@
                 <w:sz w:val="19"/>
                 <w:szCs w:val="19"/>
               </w:rPr>
-              <w:t xml:space="preserve">1.1</w:t>
+              <w:t xml:space="preserve">1.2</w:t>
             </w:r>
           </w:p>
         </w:tc>
@@ -400,7 +400,7 @@
                 <w:sz w:val="19"/>
                 <w:szCs w:val="19"/>
               </w:rPr>
-              <w:t xml:space="preserve">main — 1599152</w:t>
+              <w:t xml:space="preserve">main — 2bcc9d8</w:t>
             </w:r>
           </w:p>
         </w:tc>
@@ -472,7 +472,7 @@
                 <w:sz w:val="19"/>
                 <w:szCs w:val="19"/>
               </w:rPr>
-              <w:t xml:space="preserve">22 septembre 2026</w:t>
+              <w:t xml:space="preserve">23 septembre 2026</w:t>
             </w:r>
           </w:p>
         </w:tc>
@@ -4225,7 +4225,7 @@
           <w:sz w:val="21"/>
           <w:szCs w:val="21"/>
         </w:rPr>
-        <w:t xml:space="preserve">Quatre services transverses complètent ces modules : l'envoi des emails (dix-neuf modèles), l'assistance par intelligence artificielle, le stockage des fichiers et la génération des notifications.</w:t>
+        <w:t xml:space="preserve">Quatre services transverses complètent ces modules : l'envoi des emails (vingt-deux modèles), l'assistance par intelligence artificielle, le stockage des fichiers et la génération des notifications.</w:t>
       </w:r>
     </w:p>
     <w:p>
@@ -7478,7 +7478,7 @@
           <w:sz w:val="17"/>
           <w:szCs w:val="17"/>
         </w:rPr>
-        <w:t xml:space="preserve">               | Send back (format)                  | un reviewer ENVOIE ses commentaires</w:t>
+        <w:t xml:space="preserve">               | Send back (format)                  | décision explicite de l'éditeur</w:t>
       </w:r>
     </w:p>
     <w:p>
@@ -7494,7 +7494,7 @@
           <w:sz w:val="17"/>
           <w:szCs w:val="17"/>
         </w:rPr>
-        <w:t xml:space="preserve">               v                                     v</w:t>
+        <w:t xml:space="preserve">               v                                     |</w:t>
       </w:r>
     </w:p>
     <w:p>
@@ -7510,7 +7510,7 @@
           <w:sz w:val="17"/>
           <w:szCs w:val="17"/>
         </w:rPr>
-        <w:t xml:space="preserve">           sent_back                          revision_needed</w:t>
+        <w:t xml:space="preserve">           sent_back           +---------------------+--------------------+</w:t>
       </w:r>
     </w:p>
     <w:p>
@@ -7526,7 +7526,7 @@
           <w:sz w:val="17"/>
           <w:szCs w:val="17"/>
         </w:rPr>
-        <w:t xml:space="preserve">               |                                     | décision de l'éditeur</w:t>
+        <w:t xml:space="preserve">               |                v                     v                    v</w:t>
       </w:r>
     </w:p>
     <w:p>
@@ -7542,7 +7542,7 @@
           <w:sz w:val="17"/>
           <w:szCs w:val="17"/>
         </w:rPr>
-        <w:t xml:space="preserve">               |               +---------------------+--------------------+</w:t>
+        <w:t xml:space="preserve">               |         major / minor_revision    accepted             rejected</w:t>
       </w:r>
     </w:p>
     <w:p>
@@ -7558,7 +7558,7 @@
           <w:sz w:val="17"/>
           <w:szCs w:val="17"/>
         </w:rPr>
-        <w:t xml:space="preserve">               |               v                     v                    v</w:t>
+        <w:t xml:space="preserve">               |                |                     |</w:t>
       </w:r>
     </w:p>
     <w:p>
@@ -7574,7 +7574,7 @@
           <w:sz w:val="17"/>
           <w:szCs w:val="17"/>
         </w:rPr>
-        <w:t xml:space="preserve">               |      major / minor_revision      accepted             rejected</w:t>
+        <w:t xml:space="preserve">               +--------+-------+                     | APC réglée + PDF déposé</w:t>
       </w:r>
     </w:p>
     <w:p>
@@ -7590,7 +7590,7 @@
           <w:sz w:val="17"/>
           <w:szCs w:val="17"/>
         </w:rPr>
-        <w:t xml:space="preserve">               |               |                     |</w:t>
+        <w:t xml:space="preserve">                        v                              v</w:t>
       </w:r>
     </w:p>
     <w:p>
@@ -7606,7 +7606,7 @@
           <w:sz w:val="17"/>
           <w:szCs w:val="17"/>
         </w:rPr>
-        <w:t xml:space="preserve">               +-------+-------+                     | APC réglée + PDF déposé</w:t>
+        <w:t xml:space="preserve">         version révisée déposée par l'auteur      published</w:t>
       </w:r>
     </w:p>
     <w:p>
@@ -7622,7 +7622,7 @@
           <w:sz w:val="17"/>
           <w:szCs w:val="17"/>
         </w:rPr>
-        <w:t xml:space="preserve">                       v                             v</w:t>
+        <w:t xml:space="preserve">                        v</w:t>
       </w:r>
     </w:p>
     <w:p>
@@ -7638,39 +7638,7 @@
           <w:sz w:val="17"/>
           <w:szCs w:val="17"/>
         </w:rPr>
-        <w:t xml:space="preserve">        version révisée déposée par l'auteur     published</w:t>
-      </w:r>
-    </w:p>
-    <w:p>
-      <w:pPr>
-        <w:shd w:fill="F3F6F4" w:val="clear"/>
-        <w:spacing w:after="0" w:line="240"/>
-        <w:ind w:left="340"/>
-      </w:pPr>
-      <w:r>
-        <w:rPr>
-          <w:rFonts w:ascii="Consolas" w:cs="Consolas" w:eastAsia="Consolas" w:hAnsi="Consolas"/>
-          <w:color w:val="14361F"/>
-          <w:sz w:val="17"/>
-          <w:szCs w:val="17"/>
-        </w:rPr>
-        <w:t xml:space="preserve">                       v</w:t>
-      </w:r>
-    </w:p>
-    <w:p>
-      <w:pPr>
-        <w:shd w:fill="F3F6F4" w:val="clear"/>
-        <w:spacing w:after="0" w:line="240"/>
-        <w:ind w:left="340"/>
-      </w:pPr>
-      <w:r>
-        <w:rPr>
-          <w:rFonts w:ascii="Consolas" w:cs="Consolas" w:eastAsia="Consolas" w:hAnsi="Consolas"/>
-          <w:color w:val="14361F"/>
-          <w:sz w:val="17"/>
-          <w:szCs w:val="17"/>
-        </w:rPr>
-        <w:t xml:space="preserve">                    revised --(nouvelle acceptation)--&gt; under_review</w:t>
+        <w:t xml:space="preserve">                     revised --(nouvelle acceptation)--&gt; under_review (round 2+)</w:t>
       </w:r>
     </w:p>
     <w:p>
@@ -7725,7 +7693,7 @@
           <w:sz w:val="21"/>
           <w:szCs w:val="21"/>
         </w:rPr>
-        <w:t xml:space="preserve">Inviter un reviewer ne change pas le statut : c'est son acceptation qui fait passer l'article « Under review ».</w:t>
+        <w:t xml:space="preserve">Inviter un reviewer ne change pas le statut : c'est son acceptation qui fait passer l'article « Under review », et lui donne accès au manuscrit — pas avant.</w:t>
       </w:r>
     </w:p>
     <w:p>
@@ -7740,10 +7708,22 @@
       <w:r>
         <w:rPr>
           <w:rFonts w:ascii="Arial" w:cs="Arial" w:eastAsia="Arial" w:hAnsi="Arial"/>
+          <w:b w:val="false"/>
+          <w:bCs w:val="false"/>
           <w:sz w:val="21"/>
           <w:szCs w:val="21"/>
         </w:rPr>
-        <w:t xml:space="preserve">Les premiers commentaires reçus font passer l'article dans « Revisions ». Une décision déjà prise par l'éditeur n'est jamais écrasée.</w:t>
+        <w:t xml:space="preserve">Le statut n'avance plus automatiquement quand un reviewer rend ses commentaires : </w:t>
+      </w:r>
+      <w:r>
+        <w:rPr>
+          <w:rFonts w:ascii="Arial" w:cs="Arial" w:eastAsia="Arial" w:hAnsi="Arial"/>
+          <w:b w:val="false"/>
+          <w:bCs w:val="false"/>
+          <w:sz w:val="21"/>
+          <w:szCs w:val="21"/>
+        </w:rPr>
+        <w:t xml:space="preserve">l'article reste « Under review », tel que le voit l'auteur, tant que l'éditeur n'a pas explicitement tranché. Auparavant, le statut basculait seul en « à réviser », visible de l'auteur avant même que l'éditeur ait pris connaissance des commentaires.</w:t>
       </w:r>
     </w:p>
     <w:p>
@@ -7761,18 +7741,17 @@
           <w:sz w:val="21"/>
           <w:szCs w:val="21"/>
         </w:rPr>
-        <w:t xml:space="preserve">Chaque reviewer garde l'accès à son évaluation tant qu'il ne l'a pas rendue, même si un autre reviewer a déjà rendu la sienne.</w:t>
-      </w:r>
-    </w:p>
-    <w:p>
-      <w:pPr>
-        <w:spacing w:after="100"/>
-      </w:pPr>
-    </w:p>
-    <w:p>
-      <w:pPr>
-        <w:spacing w:after="130"/>
-        <w:jc w:val="both"/>
+        <w:t xml:space="preserve">Chaque reviewer garde l'accès à son évaluation tant qu'il ne l'a pas rendue, même si un autre a déjà rendu la sienne. L'éditeur peut inviter un reviewer supplémentaire à tout moment pendant l'évaluation, y compris après une première évaluation reçue.</w:t>
+      </w:r>
+    </w:p>
+    <w:p>
+      <w:pPr>
+        <w:pStyle w:val="ListParagraph"/>
+        <w:numPr>
+          <w:ilvl w:val="0"/>
+          <w:numId w:val="2"/>
+        </w:numPr>
+        <w:spacing w:after="70"/>
       </w:pPr>
       <w:r>
         <w:rPr>
@@ -7780,7 +7759,26 @@
           <w:sz w:val="21"/>
           <w:szCs w:val="21"/>
         </w:rPr>
-        <w:t xml:space="preserve">Chaque décision déclenche un email à l'auteur et une notification interne. Les libellés transmis à l'auteur sont ceux retenus par le comité : Accept, Reject, Major revision, Minor revision, Revision requested, Sent back to the authors.</w:t>
+        <w:t xml:space="preserve">Après le dépôt d'une version révisée, un reviewer déjà intervenu peut être réinvité pour une seconde évaluation (délai ramené à deux semaines, contre un mois pour la première).</w:t>
+      </w:r>
+    </w:p>
+    <w:p>
+      <w:pPr>
+        <w:spacing w:after="100"/>
+      </w:pPr>
+    </w:p>
+    <w:p>
+      <w:pPr>
+        <w:spacing w:after="130"/>
+        <w:jc w:val="both"/>
+      </w:pPr>
+      <w:r>
+        <w:rPr>
+          <w:rFonts w:ascii="Arial" w:cs="Arial" w:eastAsia="Arial" w:hAnsi="Arial"/>
+          <w:sz w:val="21"/>
+          <w:szCs w:val="21"/>
+        </w:rPr>
+        <w:t xml:space="preserve">Chaque décision déclenche un email à l'auteur et une notification interne. Les libellés transmis à l'auteur sont ceux retenus par le comité : Accept, Reject, Major revision, Minor revision, Revision requested, Sent back to the authors. Une décision de révision est désormais transmise au soumetteur et à chaque co-auteur déclaré, et détaille les documents attendus, le format exigé et la date limite.</w:t>
       </w:r>
     </w:p>
     <w:p>
@@ -7864,7 +7862,7 @@
           <w:sz w:val="21"/>
           <w:szCs w:val="21"/>
         </w:rPr>
-        <w:t xml:space="preserve">L'invitation contient deux liens signés par un jeton à usage unique. Après acceptation, le reviewer est conduit directement à sa page « Articles to review ».</w:t>
+        <w:t xml:space="preserve">L'invitation contient deux liens signés par un jeton à usage unique. Chaque réponse déclenche un email de confirmation au reviewer. Après acceptation, il est conduit directement à sa page « Articles to review » — et c'est seulement à partir de là que l'accès au manuscrit s'ouvre.</w:t>
       </w:r>
     </w:p>
     <w:p>
@@ -7882,7 +7880,7 @@
           <w:sz w:val="21"/>
           <w:szCs w:val="21"/>
         </w:rPr>
-        <w:t xml:space="preserve">Le reviewer dépose son évaluation : commentaires, commentaires confidentiels réservés à l'éditeur, recommandation et, si besoin, un fichier annoté.</w:t>
+        <w:t xml:space="preserve">Le reviewer dépose son évaluation : commentaires, commentaires confidentiels réservés à l'éditeur, recommandation et, si besoin, un fichier annoté. Ce dépôt ne change pas le statut du manuscrit.</w:t>
       </w:r>
     </w:p>
     <w:p>
@@ -7918,7 +7916,7 @@
           <w:sz w:val="21"/>
           <w:szCs w:val="21"/>
         </w:rPr>
-        <w:t xml:space="preserve">L'auteur dépose sa version révisée : réponse aux reviewers, manuscrit révisé en version propre, manuscrit avec suivi des modifications, et autres documents. L'équipe éditoriale est alertée, puis relance une évaluation ou décide directement.</w:t>
+        <w:t xml:space="preserve">L'auteur dépose sa version révisée : réponse aux reviewers, manuscrit révisé en version propre, manuscrit avec suivi des modifications, et autres documents (les trois premiers ne sont pas exigés après un simple renvoi pour non-conformité de format, qui précède toute évaluation). L'équipe éditoriale est alertée, peut réinviter un reviewer déjà intervenu, ou décider directement.</w:t>
       </w:r>
     </w:p>
     <w:p>
@@ -8407,7 +8405,67 @@
           <w:sz w:val="21"/>
           <w:szCs w:val="21"/>
         </w:rPr>
-        <w:t xml:space="preserve">les messages de l'éditeur à l'auteur ne sont servis qu'à l'administration et à l'auteur du manuscrit, jamais aux reviewers.</w:t>
+        <w:t xml:space="preserve">les messages de l'éditeur à l'auteur ne sont servis qu'à l'administration et à l'auteur du manuscrit, jamais aux reviewers ;</w:t>
+      </w:r>
+    </w:p>
+    <w:p>
+      <w:pPr>
+        <w:pStyle w:val="ListParagraph"/>
+        <w:numPr>
+          <w:ilvl w:val="0"/>
+          <w:numId w:val="2"/>
+        </w:numPr>
+        <w:spacing w:after="70"/>
+      </w:pPr>
+      <w:r>
+        <w:rPr>
+          <w:rFonts w:ascii="Arial" w:cs="Arial" w:eastAsia="Arial" w:hAnsi="Arial"/>
+          <w:b w:val="false"/>
+          <w:bCs w:val="false"/>
+          <w:sz w:val="21"/>
+          <w:szCs w:val="21"/>
+        </w:rPr>
+        <w:t xml:space="preserve">un reviewer n'a accès ni au manuscrit ni au formulaire d'évaluation tant qu'il n'a pas accepté l'invitation</w:t>
+      </w:r>
+      <w:r>
+        <w:rPr>
+          <w:rFonts w:ascii="Arial" w:cs="Arial" w:eastAsia="Arial" w:hAnsi="Arial"/>
+          <w:b w:val="false"/>
+          <w:bCs w:val="false"/>
+          <w:sz w:val="21"/>
+          <w:szCs w:val="21"/>
+        </w:rPr>
+        <w:t xml:space="preserve"> — un contrôle qui portait auparavant seulement sur la propriété de l'évaluation, pas sur son statut, et qui a été renforcé le 23 septembre ;</w:t>
+      </w:r>
+    </w:p>
+    <w:p>
+      <w:pPr>
+        <w:pStyle w:val="ListParagraph"/>
+        <w:numPr>
+          <w:ilvl w:val="0"/>
+          <w:numId w:val="2"/>
+        </w:numPr>
+        <w:spacing w:after="70"/>
+      </w:pPr>
+      <w:r>
+        <w:rPr>
+          <w:rFonts w:ascii="Arial" w:cs="Arial" w:eastAsia="Arial" w:hAnsi="Arial"/>
+          <w:b/>
+          <w:bCs/>
+          <w:sz w:val="21"/>
+          <w:szCs w:val="21"/>
+        </w:rPr>
+        <w:t xml:space="preserve">double-aveugle : </w:t>
+      </w:r>
+      <w:r>
+        <w:rPr>
+          <w:rFonts w:ascii="Arial" w:cs="Arial" w:eastAsia="Arial" w:hAnsi="Arial"/>
+          <w:b w:val="false"/>
+          <w:bCs w:val="false"/>
+          <w:sz w:val="21"/>
+          <w:szCs w:val="21"/>
+        </w:rPr>
+        <w:t xml:space="preserve">la page de titre d'un manuscrit (identité et affiliations des auteurs) n'est jamais transmise à un reviewer, quelle que soit la manière dont il consulte les fichiers du manuscrit.</w:t>
       </w:r>
     </w:p>
     <w:p>
@@ -18991,7 +19049,7 @@
         <w:sz w:val="16"/>
         <w:szCs w:val="16"/>
       </w:rPr>
-      <w:t xml:space="preserve">	Version 1.1</w:t>
+      <w:t xml:space="preserve">	Version 1.2</w:t>
     </w:r>
   </w:p>
 </w:hdr>

</xml_diff>

<commit_message>
docs: documentation technique v1.3 (remarques du 25/09)
Co-Authored-By: Claude Sonnet 5 <noreply@anthropic.com>
</commit_message>
<xml_diff>
--- a/Documentation Technique JAEI.docx
+++ b/Documentation Technique JAEI.docx
@@ -328,7 +328,7 @@
                 <w:sz w:val="19"/>
                 <w:szCs w:val="19"/>
               </w:rPr>
-              <w:t xml:space="preserve">1.2</w:t>
+              <w:t xml:space="preserve">1.3</w:t>
             </w:r>
           </w:p>
         </w:tc>
@@ -400,7 +400,7 @@
                 <w:sz w:val="19"/>
                 <w:szCs w:val="19"/>
               </w:rPr>
-              <w:t xml:space="preserve">main — 2bcc9d8</w:t>
+              <w:t xml:space="preserve">main — f49c38b</w:t>
             </w:r>
           </w:p>
         </w:tc>
@@ -472,7 +472,7 @@
                 <w:sz w:val="19"/>
                 <w:szCs w:val="19"/>
               </w:rPr>
-              <w:t xml:space="preserve">23 septembre 2026</w:t>
+              <w:t xml:space="preserve">26 septembre 2026</w:t>
             </w:r>
           </w:p>
         </w:tc>
@@ -19049,7 +19049,7 @@
         <w:sz w:val="16"/>
         <w:szCs w:val="16"/>
       </w:rPr>
-      <w:t xml:space="preserve">	Version 1.2</w:t>
+      <w:t xml:space="preserve">	Version 1.3</w:t>
     </w:r>
   </w:p>
 </w:hdr>

</xml_diff>

<commit_message>
docs: documentation technique v1.4 (remarques du 27/09)
Co-Authored-By: Claude Sonnet 5 <noreply@anthropic.com>
</commit_message>
<xml_diff>
--- a/Documentation Technique JAEI.docx
+++ b/Documentation Technique JAEI.docx
@@ -328,7 +328,7 @@
                 <w:sz w:val="19"/>
                 <w:szCs w:val="19"/>
               </w:rPr>
-              <w:t xml:space="preserve">1.3</w:t>
+              <w:t xml:space="preserve">1.4</w:t>
             </w:r>
           </w:p>
         </w:tc>
@@ -400,7 +400,7 @@
                 <w:sz w:val="19"/>
                 <w:szCs w:val="19"/>
               </w:rPr>
-              <w:t xml:space="preserve">main — f49c38b</w:t>
+              <w:t xml:space="preserve">main — 2f99b0b</w:t>
             </w:r>
           </w:p>
         </w:tc>
@@ -472,7 +472,7 @@
                 <w:sz w:val="19"/>
                 <w:szCs w:val="19"/>
               </w:rPr>
-              <w:t xml:space="preserve">26 septembre 2026</w:t>
+              <w:t xml:space="preserve">28 septembre 2026</w:t>
             </w:r>
           </w:p>
         </w:tc>
@@ -19049,7 +19049,7 @@
         <w:sz w:val="16"/>
         <w:szCs w:val="16"/>
       </w:rPr>
-      <w:t xml:space="preserve">	Version 1.3</w:t>
+      <w:t xml:space="preserve">	Version 1.4</w:t>
     </w:r>
   </w:p>
 </w:hdr>

</xml_diff>

<commit_message>
docs: documentation technique v1.5 (remarque du 28/09)
Co-Authored-By: Claude Sonnet 5 <noreply@anthropic.com>
</commit_message>
<xml_diff>
--- a/Documentation Technique JAEI.docx
+++ b/Documentation Technique JAEI.docx
@@ -328,7 +328,7 @@
                 <w:sz w:val="19"/>
                 <w:szCs w:val="19"/>
               </w:rPr>
-              <w:t xml:space="preserve">1.4</w:t>
+              <w:t xml:space="preserve">1.5</w:t>
             </w:r>
           </w:p>
         </w:tc>
@@ -400,7 +400,7 @@
                 <w:sz w:val="19"/>
                 <w:szCs w:val="19"/>
               </w:rPr>
-              <w:t xml:space="preserve">main — 2f99b0b</w:t>
+              <w:t xml:space="preserve">main — 487563f</w:t>
             </w:r>
           </w:p>
         </w:tc>
@@ -472,7 +472,7 @@
                 <w:sz w:val="19"/>
                 <w:szCs w:val="19"/>
               </w:rPr>
-              <w:t xml:space="preserve">28 septembre 2026</w:t>
+              <w:t xml:space="preserve">29 septembre 2026</w:t>
             </w:r>
           </w:p>
         </w:tc>
@@ -19049,7 +19049,7 @@
         <w:sz w:val="16"/>
         <w:szCs w:val="16"/>
       </w:rPr>
-      <w:t xml:space="preserve">	Version 1.4</w:t>
+      <w:t xml:space="preserve">	Version 1.5</w:t>
     </w:r>
   </w:p>
 </w:hdr>

</xml_diff>